<commit_message>
Docs: corregge formattazione docx e aggiorna markdown
Rigenera Manuale_Cassa_Dalila.docx con spaziatura identica all'originale:
titolo con gap visivi corretti, sp=40/40 su elenchi, sp=120 su paragrafi
normali, "MANUALE UTENTE" come riga separata bold navy.
Aggiorna v2.md con header separato in due righe.

Co-Authored-By: Claude Sonnet 4.6 <noreply@anthropic.com>
</commit_message>
<xml_diff>
--- a/Manuale_Cassa_Dalila.docx
+++ b/Manuale_Cassa_Dalila.docx
@@ -5,6 +5,7 @@
     <w:p>
       <w:pPr>
         <w:jc w:val="center"/>
+        <w:spacing w:after="200"/>
       </w:pPr>
       <w:r>
         <w:rPr>
@@ -18,6 +19,7 @@
     <w:p>
       <w:pPr>
         <w:jc w:val="center"/>
+        <w:spacing w:after="600"/>
       </w:pPr>
       <w:r>
         <w:rPr>
@@ -25,12 +27,27 @@
           <w:color w:val="666666"/>
           <w:sz w:val="36"/>
         </w:rPr>
-        <w:t>Sistema di cassa per oratori — MANUALE UTENTE</w:t>
+        <w:t>Sistema di cassa per oratori</w:t>
       </w:r>
     </w:p>
     <w:p>
       <w:pPr>
         <w:jc w:val="center"/>
+        <w:spacing w:before="600" w:after="120"/>
+      </w:pPr>
+      <w:r>
+        <w:rPr>
+          <w:b/>
+          <w:color w:val="1A5276"/>
+          <w:sz w:val="36"/>
+        </w:rPr>
+        <w:t>MANUALE UTENTE</w:t>
+      </w:r>
+    </w:p>
+    <w:p>
+      <w:pPr>
+        <w:jc w:val="center"/>
+        <w:spacing w:after="2000"/>
       </w:pPr>
       <w:r>
         <w:rPr>
@@ -43,10 +60,10 @@
     <w:p>
       <w:pPr>
         <w:jc w:val="center"/>
-      </w:pPr>
-      <w:r>
-        <w:rPr>
-          <w:b/>
+        <w:spacing w:after="120"/>
+      </w:pPr>
+      <w:r>
+        <w:rPr>
           <w:color w:val="666666"/>
         </w:rPr>
         <w:t>Versione 1.4 | 2026</w:t>
@@ -61,11 +78,17 @@
       </w:r>
     </w:p>
     <w:p>
+      <w:pPr>
+        <w:spacing w:after="120"/>
+      </w:pPr>
       <w:r>
         <w:t>Cassa Dalila è un sistema di cassa open source progettato specificamente per le esigenze degli oratori italiani. Permette di gestire vendite, scorte, comande per la cucina e statistiche di incasso, il tutto senza bisogno di connessione internet e con la possibilità di usare più dispositivi contemporaneamente sulla stessa rete WiFi.</w:t>
       </w:r>
     </w:p>
     <w:p>
+      <w:pPr>
+        <w:spacing w:after="120"/>
+      </w:pPr>
       <w:r>
         <w:t>Il sistema è completamente autonomo: gira su un normale PC Windows e non richiede abbonamenti, account cloud o software commerciali. I dati rimangono sul vostro hardware.</w:t>
       </w:r>
@@ -88,6 +111,7 @@
           <w:ilvl w:val="0"/>
           <w:numId w:val="2"/>
         </w:numPr>
+        <w:spacing w:before="40" w:after="40"/>
       </w:pPr>
       <w:r>
         <w:t>Vendere prodotti e incassare pagamenti in contanti, carta, Satispay, buono volontario o omaggio</w:t>
@@ -100,6 +124,7 @@
           <w:ilvl w:val="0"/>
           <w:numId w:val="2"/>
         </w:numPr>
+        <w:spacing w:before="40" w:after="40"/>
       </w:pPr>
       <w:r>
         <w:t>Gestire buoni per i volontari con saldo residuo in tempo reale</w:t>
@@ -112,6 +137,7 @@
           <w:ilvl w:val="0"/>
           <w:numId w:val="2"/>
         </w:numPr>
+        <w:spacing w:before="40" w:after="40"/>
       </w:pPr>
       <w:r>
         <w:t>Gestire il magazzino con scorte e soglie di allarme</w:t>
@@ -124,6 +150,7 @@
           <w:ilvl w:val="0"/>
           <w:numId w:val="2"/>
         </w:numPr>
+        <w:spacing w:before="40" w:after="40"/>
       </w:pPr>
       <w:r>
         <w:t>Inviare automaticamente le comande alla cucina o al bar</w:t>
@@ -136,6 +163,7 @@
           <w:ilvl w:val="0"/>
           <w:numId w:val="2"/>
         </w:numPr>
+        <w:spacing w:before="40" w:after="40"/>
       </w:pPr>
       <w:r>
         <w:t>Usare tablet e telefoni come casse aggiuntive sulla rete WiFi</w:t>
@@ -148,6 +176,7 @@
           <w:ilvl w:val="0"/>
           <w:numId w:val="2"/>
         </w:numPr>
+        <w:spacing w:before="40" w:after="40"/>
       </w:pPr>
       <w:r>
         <w:t>Consultare statistiche di vendita e incassi con distinzione tra incasso reale e costi</w:t>
@@ -160,6 +189,7 @@
           <w:ilvl w:val="0"/>
           <w:numId w:val="2"/>
         </w:numPr>
+        <w:spacing w:before="40" w:after="40"/>
       </w:pPr>
       <w:r>
         <w:t>Stampare o esportare i dati in Excel</w:t>
@@ -172,6 +202,7 @@
           <w:ilvl w:val="0"/>
           <w:numId w:val="2"/>
         </w:numPr>
+        <w:spacing w:before="40" w:after="40"/>
       </w:pPr>
       <w:r>
         <w:t>Ricevere il report di chiusura via email con allegato Excel multi-foglio</w:t>
@@ -184,6 +215,7 @@
           <w:ilvl w:val="0"/>
           <w:numId w:val="2"/>
         </w:numPr>
+        <w:spacing w:before="40" w:after="40"/>
       </w:pPr>
       <w:r>
         <w:t>Gestire ordini da asporto con evidenziazione dedicata</w:t>
@@ -196,6 +228,7 @@
           <w:ilvl w:val="0"/>
           <w:numId w:val="2"/>
         </w:numPr>
+        <w:spacing w:before="40" w:after="40"/>
       </w:pPr>
       <w:r>
         <w:t>Ristampare scontrini dallo storico</w:t>
@@ -208,6 +241,7 @@
           <w:ilvl w:val="0"/>
           <w:numId w:val="2"/>
         </w:numPr>
+        <w:spacing w:before="40" w:after="40"/>
       </w:pPr>
       <w:r>
         <w:t>Passare in modalità schermo intero con un pulsante dedicato</w:t>
@@ -243,8 +277,6 @@
               <w:left w:val="single" w:sz="1" w:space="0" w:color="CCCCCC"/>
               <w:bottom w:val="single" w:sz="1" w:space="0" w:color="CCCCCC"/>
               <w:right w:val="single" w:sz="1" w:space="0" w:color="CCCCCC"/>
-              <w:insideH w:val="single" w:sz="1" w:space="0" w:color="CCCCCC"/>
-              <w:insideV w:val="single" w:sz="1" w:space="0" w:color="CCCCCC"/>
             </w:tcBorders>
             <w:shd w:val="clear" w:color="auto" w:fill="F5F5F5"/>
           </w:tcPr>
@@ -272,8 +304,6 @@
               <w:left w:val="single" w:sz="1" w:space="0" w:color="CCCCCC"/>
               <w:bottom w:val="single" w:sz="1" w:space="0" w:color="CCCCCC"/>
               <w:right w:val="single" w:sz="1" w:space="0" w:color="CCCCCC"/>
-              <w:insideH w:val="single" w:sz="1" w:space="0" w:color="CCCCCC"/>
-              <w:insideV w:val="single" w:sz="1" w:space="0" w:color="CCCCCC"/>
             </w:tcBorders>
             <w:shd w:val="clear" w:color="auto" w:fill="F5F5F5"/>
           </w:tcPr>
@@ -303,8 +333,6 @@
               <w:left w:val="single" w:sz="1" w:space="0" w:color="CCCCCC"/>
               <w:bottom w:val="single" w:sz="1" w:space="0" w:color="CCCCCC"/>
               <w:right w:val="single" w:sz="1" w:space="0" w:color="CCCCCC"/>
-              <w:insideH w:val="single" w:sz="1" w:space="0" w:color="CCCCCC"/>
-              <w:insideV w:val="single" w:sz="1" w:space="0" w:color="CCCCCC"/>
             </w:tcBorders>
             <w:shd w:val="clear" w:color="auto" w:fill="F9FAFB"/>
           </w:tcPr>
@@ -323,8 +351,6 @@
               <w:left w:val="single" w:sz="1" w:space="0" w:color="CCCCCC"/>
               <w:bottom w:val="single" w:sz="1" w:space="0" w:color="CCCCCC"/>
               <w:right w:val="single" w:sz="1" w:space="0" w:color="CCCCCC"/>
-              <w:insideH w:val="single" w:sz="1" w:space="0" w:color="CCCCCC"/>
-              <w:insideV w:val="single" w:sz="1" w:space="0" w:color="CCCCCC"/>
             </w:tcBorders>
             <w:shd w:val="clear" w:color="auto" w:fill="F9FAFB"/>
           </w:tcPr>
@@ -345,8 +371,6 @@
               <w:left w:val="single" w:sz="1" w:space="0" w:color="CCCCCC"/>
               <w:bottom w:val="single" w:sz="1" w:space="0" w:color="CCCCCC"/>
               <w:right w:val="single" w:sz="1" w:space="0" w:color="CCCCCC"/>
-              <w:insideH w:val="single" w:sz="1" w:space="0" w:color="CCCCCC"/>
-              <w:insideV w:val="single" w:sz="1" w:space="0" w:color="CCCCCC"/>
             </w:tcBorders>
           </w:tcPr>
           <w:p>
@@ -364,8 +388,6 @@
               <w:left w:val="single" w:sz="1" w:space="0" w:color="CCCCCC"/>
               <w:bottom w:val="single" w:sz="1" w:space="0" w:color="CCCCCC"/>
               <w:right w:val="single" w:sz="1" w:space="0" w:color="CCCCCC"/>
-              <w:insideH w:val="single" w:sz="1" w:space="0" w:color="CCCCCC"/>
-              <w:insideV w:val="single" w:sz="1" w:space="0" w:color="CCCCCC"/>
             </w:tcBorders>
           </w:tcPr>
           <w:p>
@@ -385,8 +407,6 @@
               <w:left w:val="single" w:sz="1" w:space="0" w:color="CCCCCC"/>
               <w:bottom w:val="single" w:sz="1" w:space="0" w:color="CCCCCC"/>
               <w:right w:val="single" w:sz="1" w:space="0" w:color="CCCCCC"/>
-              <w:insideH w:val="single" w:sz="1" w:space="0" w:color="CCCCCC"/>
-              <w:insideV w:val="single" w:sz="1" w:space="0" w:color="CCCCCC"/>
             </w:tcBorders>
             <w:shd w:val="clear" w:color="auto" w:fill="F9FAFB"/>
           </w:tcPr>
@@ -405,8 +425,6 @@
               <w:left w:val="single" w:sz="1" w:space="0" w:color="CCCCCC"/>
               <w:bottom w:val="single" w:sz="1" w:space="0" w:color="CCCCCC"/>
               <w:right w:val="single" w:sz="1" w:space="0" w:color="CCCCCC"/>
-              <w:insideH w:val="single" w:sz="1" w:space="0" w:color="CCCCCC"/>
-              <w:insideV w:val="single" w:sz="1" w:space="0" w:color="CCCCCC"/>
             </w:tcBorders>
             <w:shd w:val="clear" w:color="auto" w:fill="F9FAFB"/>
           </w:tcPr>
@@ -427,8 +445,6 @@
               <w:left w:val="single" w:sz="1" w:space="0" w:color="CCCCCC"/>
               <w:bottom w:val="single" w:sz="1" w:space="0" w:color="CCCCCC"/>
               <w:right w:val="single" w:sz="1" w:space="0" w:color="CCCCCC"/>
-              <w:insideH w:val="single" w:sz="1" w:space="0" w:color="CCCCCC"/>
-              <w:insideV w:val="single" w:sz="1" w:space="0" w:color="CCCCCC"/>
             </w:tcBorders>
           </w:tcPr>
           <w:p>
@@ -446,8 +462,6 @@
               <w:left w:val="single" w:sz="1" w:space="0" w:color="CCCCCC"/>
               <w:bottom w:val="single" w:sz="1" w:space="0" w:color="CCCCCC"/>
               <w:right w:val="single" w:sz="1" w:space="0" w:color="CCCCCC"/>
-              <w:insideH w:val="single" w:sz="1" w:space="0" w:color="CCCCCC"/>
-              <w:insideV w:val="single" w:sz="1" w:space="0" w:color="CCCCCC"/>
             </w:tcBorders>
           </w:tcPr>
           <w:p>
@@ -467,8 +481,6 @@
               <w:left w:val="single" w:sz="1" w:space="0" w:color="CCCCCC"/>
               <w:bottom w:val="single" w:sz="1" w:space="0" w:color="CCCCCC"/>
               <w:right w:val="single" w:sz="1" w:space="0" w:color="CCCCCC"/>
-              <w:insideH w:val="single" w:sz="1" w:space="0" w:color="CCCCCC"/>
-              <w:insideV w:val="single" w:sz="1" w:space="0" w:color="CCCCCC"/>
             </w:tcBorders>
             <w:shd w:val="clear" w:color="auto" w:fill="F9FAFB"/>
           </w:tcPr>
@@ -487,8 +499,6 @@
               <w:left w:val="single" w:sz="1" w:space="0" w:color="CCCCCC"/>
               <w:bottom w:val="single" w:sz="1" w:space="0" w:color="CCCCCC"/>
               <w:right w:val="single" w:sz="1" w:space="0" w:color="CCCCCC"/>
-              <w:insideH w:val="single" w:sz="1" w:space="0" w:color="CCCCCC"/>
-              <w:insideV w:val="single" w:sz="1" w:space="0" w:color="CCCCCC"/>
             </w:tcBorders>
             <w:shd w:val="clear" w:color="auto" w:fill="F9FAFB"/>
           </w:tcPr>
@@ -521,6 +531,9 @@
       </w:r>
     </w:p>
     <w:p>
+      <w:pPr>
+        <w:spacing w:after="120"/>
+      </w:pPr>
       <w:r>
         <w:t>Il modo più semplice per installare Cassa Dalila è usare l'installer grafico incluso nel pacchetto.</w:t>
       </w:r>
@@ -532,6 +545,7 @@
           <w:ilvl w:val="0"/>
           <w:numId w:val="3"/>
         </w:numPr>
+        <w:spacing w:before="40" w:after="40"/>
       </w:pPr>
       <w:r>
         <w:t>Scarica e installa Node.js da nodejs.org (scegli la versione LTS).</w:t>
@@ -544,6 +558,7 @@
           <w:ilvl w:val="0"/>
           <w:numId w:val="3"/>
         </w:numPr>
+        <w:spacing w:before="40" w:after="40"/>
       </w:pPr>
       <w:r>
         <w:t>Estrai il contenuto dello ZIP in una cartella qualsiasi sul PC.</w:t>
@@ -556,6 +571,7 @@
           <w:ilvl w:val="0"/>
           <w:numId w:val="3"/>
         </w:numPr>
+        <w:spacing w:before="40" w:after="40"/>
       </w:pPr>
       <w:r>
         <w:t xml:space="preserve">Fai doppio clic su </w:t>
@@ -577,6 +593,7 @@
           <w:ilvl w:val="0"/>
           <w:numId w:val="3"/>
         </w:numPr>
+        <w:spacing w:before="40" w:after="40"/>
       </w:pPr>
       <w:r>
         <w:t>Scegli dove installare (PC o chiavetta USB), inserisci email e password, scegli le opzioni.</w:t>
@@ -589,6 +606,7 @@
           <w:ilvl w:val="0"/>
           <w:numId w:val="3"/>
         </w:numPr>
+        <w:spacing w:before="40" w:after="40"/>
       </w:pPr>
       <w:r>
         <w:t xml:space="preserve">Clicca </w:t>
@@ -610,6 +628,7 @@
           <w:ilvl w:val="0"/>
           <w:numId w:val="3"/>
         </w:numPr>
+        <w:spacing w:before="40" w:after="40"/>
       </w:pPr>
       <w:r>
         <w:t>Al termine, la cassa si avvia da sola se hai selezionato l'opzione.</w:t>
@@ -653,6 +672,7 @@
           <w:ilvl w:val="0"/>
           <w:numId w:val="3"/>
         </w:numPr>
+        <w:spacing w:before="40" w:after="40"/>
       </w:pPr>
       <w:r>
         <w:t>Scarica e installa Node.js da nodejs.org (scegli la versione LTS). Serve solo questa prima volta.</w:t>
@@ -665,6 +685,7 @@
           <w:ilvl w:val="0"/>
           <w:numId w:val="3"/>
         </w:numPr>
+        <w:spacing w:before="40" w:after="40"/>
       </w:pPr>
       <w:r>
         <w:t>Estrai il contenuto dello ZIP di Cassa Dalila in una cartella definitiva, ad esempio `C:\CassaOratorio\`</w:t>
@@ -677,6 +698,7 @@
           <w:ilvl w:val="0"/>
           <w:numId w:val="3"/>
         </w:numPr>
+        <w:spacing w:before="40" w:after="40"/>
       </w:pPr>
       <w:r>
         <w:t xml:space="preserve">Fai doppio clic su </w:t>
@@ -698,6 +720,7 @@
           <w:ilvl w:val="0"/>
           <w:numId w:val="3"/>
         </w:numPr>
+        <w:spacing w:before="40" w:after="40"/>
       </w:pPr>
       <w:r>
         <w:t xml:space="preserve">Fai clic destro su </w:t>
@@ -728,6 +751,7 @@
           <w:ilvl w:val="0"/>
           <w:numId w:val="3"/>
         </w:numPr>
+        <w:spacing w:before="40" w:after="40"/>
       </w:pPr>
       <w:r>
         <w:t>Al primo avvio inserisci email e password per l'account amministratore. Conservale.</w:t>
@@ -740,6 +764,7 @@
           <w:ilvl w:val="0"/>
           <w:numId w:val="3"/>
         </w:numPr>
+        <w:spacing w:before="40" w:after="40"/>
       </w:pPr>
       <w:r>
         <w:t>Si apre automaticamente il browser con la cassa pronta.</w:t>
@@ -752,6 +777,7 @@
           <w:ilvl w:val="0"/>
           <w:numId w:val="3"/>
         </w:numPr>
+        <w:spacing w:before="40" w:after="40"/>
       </w:pPr>
       <w:r>
         <w:t xml:space="preserve">Vai su </w:t>
@@ -798,6 +824,9 @@
       </w:r>
     </w:p>
     <w:p>
+      <w:pPr>
+        <w:spacing w:after="120"/>
+      </w:pPr>
       <w:r>
         <w:t>Cassa Dalila è completamente portabile: puoi usarla da una chiavetta USB su qualsiasi PC Windows senza installare nulla (tranne Node.js per la prima compilazione).</w:t>
       </w:r>
@@ -809,6 +838,7 @@
           <w:ilvl w:val="0"/>
           <w:numId w:val="3"/>
         </w:numPr>
+        <w:spacing w:before="40" w:after="40"/>
       </w:pPr>
       <w:r>
         <w:t>Su un PC con Node.js installato, estrai lo ZIP in una cartella temporanea.</w:t>
@@ -821,6 +851,7 @@
           <w:ilvl w:val="0"/>
           <w:numId w:val="3"/>
         </w:numPr>
+        <w:spacing w:before="40" w:after="40"/>
       </w:pPr>
       <w:r>
         <w:t xml:space="preserve">Fai doppio clic su </w:t>
@@ -842,6 +873,7 @@
           <w:ilvl w:val="0"/>
           <w:numId w:val="3"/>
         </w:numPr>
+        <w:spacing w:before="40" w:after="40"/>
       </w:pPr>
       <w:r>
         <w:t>Copia l'intera cartella sulla chiavetta USB.</w:t>
@@ -854,6 +886,7 @@
           <w:ilvl w:val="0"/>
           <w:numId w:val="3"/>
         </w:numPr>
+        <w:spacing w:before="40" w:after="40"/>
       </w:pPr>
       <w:r>
         <w:t xml:space="preserve">Sulla chiavetta, usa solo </w:t>
@@ -900,6 +933,9 @@
       </w:r>
     </w:p>
     <w:p>
+      <w:pPr>
+        <w:spacing w:after="120"/>
+      </w:pPr>
       <w:r>
         <w:t>Per aggiornare il software senza perdere i dati:</w:t>
       </w:r>
@@ -911,6 +947,7 @@
           <w:ilvl w:val="0"/>
           <w:numId w:val="3"/>
         </w:numPr>
+        <w:spacing w:before="40" w:after="40"/>
       </w:pPr>
       <w:r>
         <w:t>Sostituisci i file modificati (`CassaOratorio.ps1`, `BUILD_FRONTEND.bat`, e i file in `frontend-src/`).</w:t>
@@ -923,6 +960,7 @@
           <w:ilvl w:val="0"/>
           <w:numId w:val="3"/>
         </w:numPr>
+        <w:spacing w:before="40" w:after="40"/>
       </w:pPr>
       <w:r>
         <w:t xml:space="preserve">Esegui </w:t>
@@ -944,6 +982,7 @@
           <w:ilvl w:val="0"/>
           <w:numId w:val="3"/>
         </w:numPr>
+        <w:spacing w:before="40" w:after="40"/>
       </w:pPr>
       <w:r>
         <w:t xml:space="preserve">Riavvia </w:t>
@@ -998,6 +1037,9 @@
       </w:r>
     </w:p>
     <w:p>
+      <w:pPr>
+        <w:spacing w:after="120"/>
+      </w:pPr>
       <w:r>
         <w:t>Ogni giorno, per avviare la cassa:</w:t>
       </w:r>
@@ -1009,6 +1051,7 @@
           <w:ilvl w:val="0"/>
           <w:numId w:val="3"/>
         </w:numPr>
+        <w:spacing w:before="40" w:after="40"/>
       </w:pPr>
       <w:r>
         <w:t xml:space="preserve">Fai doppio clic su </w:t>
@@ -1027,6 +1070,7 @@
           <w:ilvl w:val="0"/>
           <w:numId w:val="3"/>
         </w:numPr>
+        <w:spacing w:before="40" w:after="40"/>
       </w:pPr>
       <w:r>
         <w:t>Si apre la finestra nera del server e poi il browser con la cassa</w:t>
@@ -1039,6 +1083,7 @@
           <w:ilvl w:val="0"/>
           <w:numId w:val="3"/>
         </w:numPr>
+        <w:spacing w:before="40" w:after="40"/>
       </w:pPr>
       <w:r>
         <w:t>Puoi usare la cassa normalmente</w:t>
@@ -1085,6 +1130,9 @@
       </w:r>
     </w:p>
     <w:p>
+      <w:pPr>
+        <w:spacing w:after="120"/>
+      </w:pPr>
       <w:r>
         <w:t>Per spegnere il sistema a fine giornata:</w:t>
       </w:r>
@@ -1096,6 +1144,7 @@
           <w:ilvl w:val="0"/>
           <w:numId w:val="2"/>
         </w:numPr>
+        <w:spacing w:before="40" w:after="40"/>
       </w:pPr>
       <w:r>
         <w:t>Chiudi la finestra nera di PocketBase, oppure</w:t>
@@ -1108,6 +1157,7 @@
           <w:ilvl w:val="0"/>
           <w:numId w:val="2"/>
         </w:numPr>
+        <w:spacing w:before="40" w:after="40"/>
       </w:pPr>
       <w:r>
         <w:t xml:space="preserve">Premi </w:t>
@@ -1163,6 +1213,9 @@
       </w:r>
     </w:p>
     <w:p>
+      <w:pPr>
+        <w:spacing w:after="120"/>
+      </w:pPr>
       <w:r>
         <w:t>Puoi usare tablet e telefoni come casse aggiuntive o per visualizzare le comande, purché siano sulla stessa rete WiFi del PC.</w:t>
       </w:r>
@@ -1174,6 +1227,7 @@
           <w:ilvl w:val="0"/>
           <w:numId w:val="3"/>
         </w:numPr>
+        <w:spacing w:before="40" w:after="40"/>
       </w:pPr>
       <w:r>
         <w:t>Avvia la cassa sul PC come amministratore.</w:t>
@@ -1186,6 +1240,7 @@
           <w:ilvl w:val="0"/>
           <w:numId w:val="3"/>
         </w:numPr>
+        <w:spacing w:before="40" w:after="40"/>
       </w:pPr>
       <w:r>
         <w:t>Il browser si apre automaticamente sull'indirizzo IP di rete corretto (es. `http://192.168.1.15:8090`).</w:t>
@@ -1198,6 +1253,7 @@
           <w:ilvl w:val="0"/>
           <w:numId w:val="3"/>
         </w:numPr>
+        <w:spacing w:before="40" w:after="40"/>
       </w:pPr>
       <w:r>
         <w:t xml:space="preserve">Nella pagina </w:t>
@@ -1219,6 +1275,7 @@
           <w:ilvl w:val="0"/>
           <w:numId w:val="3"/>
         </w:numPr>
+        <w:spacing w:before="40" w:after="40"/>
       </w:pPr>
       <w:r>
         <w:t>Inquadra il QR Code con la fotocamera del tablet — si apre direttamente la cassa.</w:t>
@@ -1253,6 +1310,9 @@
       </w:r>
     </w:p>
     <w:p>
+      <w:pPr>
+        <w:spacing w:after="120"/>
+      </w:pPr>
       <w:r>
         <w:t xml:space="preserve">Prima di usare la cassa devi configurare prodotti, famiglie e comande. Accedi a </w:t>
       </w:r>
@@ -1278,6 +1338,9 @@
       </w:r>
     </w:p>
     <w:p>
+      <w:pPr>
+        <w:spacing w:after="120"/>
+      </w:pPr>
       <w:r>
         <w:t>Le famiglie raggruppano i prodotti per categoria (es. Fritti, Bar, Dolci). Ogni famiglia ha un colore che appare sui pulsanti della cassa.</w:t>
       </w:r>
@@ -1289,6 +1352,7 @@
           <w:ilvl w:val="0"/>
           <w:numId w:val="3"/>
         </w:numPr>
+        <w:spacing w:before="40" w:after="40"/>
       </w:pPr>
       <w:r>
         <w:t xml:space="preserve">Vai su </w:t>
@@ -1307,6 +1371,7 @@
           <w:ilvl w:val="0"/>
           <w:numId w:val="3"/>
         </w:numPr>
+        <w:spacing w:before="40" w:after="40"/>
       </w:pPr>
       <w:r>
         <w:t xml:space="preserve">Clicca su </w:t>
@@ -1325,6 +1390,7 @@
           <w:ilvl w:val="0"/>
           <w:numId w:val="3"/>
         </w:numPr>
+        <w:spacing w:before="40" w:after="40"/>
       </w:pPr>
       <w:r>
         <w:t>Inserisci il nome e scegli un colore</w:t>
@@ -1337,6 +1403,7 @@
           <w:ilvl w:val="0"/>
           <w:numId w:val="3"/>
         </w:numPr>
+        <w:spacing w:before="40" w:after="40"/>
       </w:pPr>
       <w:r>
         <w:t>Ripeti per tutte le categorie</w:t>
@@ -1374,6 +1441,9 @@
       </w:r>
     </w:p>
     <w:p>
+      <w:pPr>
+        <w:spacing w:after="120"/>
+      </w:pPr>
       <w:r>
         <w:t>Ogni prodotto appartiene a una famiglia e ha un prezzo e una scorta.</w:t>
       </w:r>
@@ -1385,6 +1455,7 @@
           <w:ilvl w:val="0"/>
           <w:numId w:val="3"/>
         </w:numPr>
+        <w:spacing w:before="40" w:after="40"/>
       </w:pPr>
       <w:r>
         <w:t xml:space="preserve">Vai su </w:t>
@@ -1403,6 +1474,7 @@
           <w:ilvl w:val="0"/>
           <w:numId w:val="3"/>
         </w:numPr>
+        <w:spacing w:before="40" w:after="40"/>
       </w:pPr>
       <w:r>
         <w:t xml:space="preserve">Clicca su </w:t>
@@ -1421,6 +1493,7 @@
           <w:ilvl w:val="0"/>
           <w:numId w:val="3"/>
         </w:numPr>
+        <w:spacing w:before="40" w:after="40"/>
       </w:pPr>
       <w:r>
         <w:t>Compila: nome, prezzo, famiglia, scorta iniziale e soglia di allarme</w:t>
@@ -1433,6 +1506,7 @@
           <w:ilvl w:val="0"/>
           <w:numId w:val="3"/>
         </w:numPr>
+        <w:spacing w:before="40" w:after="40"/>
       </w:pPr>
       <w:r>
         <w:t>Se la scorta è illimitata, imposta `-1` come quantità</w:t>
@@ -1479,6 +1553,9 @@
       </w:r>
     </w:p>
     <w:p>
+      <w:pPr>
+        <w:spacing w:after="120"/>
+      </w:pPr>
       <w:r>
         <w:t>Le comande servono per inviare gli ordini alle stazioni di preparazione (cucina, bar, griglia).</w:t>
       </w:r>
@@ -1490,6 +1567,7 @@
           <w:ilvl w:val="0"/>
           <w:numId w:val="3"/>
         </w:numPr>
+        <w:spacing w:before="40" w:after="40"/>
       </w:pPr>
       <w:r>
         <w:t xml:space="preserve">Vai su </w:t>
@@ -1508,6 +1586,7 @@
           <w:ilvl w:val="0"/>
           <w:numId w:val="3"/>
         </w:numPr>
+        <w:spacing w:before="40" w:after="40"/>
       </w:pPr>
       <w:r>
         <w:t xml:space="preserve">Clicca su </w:t>
@@ -1526,6 +1605,7 @@
           <w:ilvl w:val="0"/>
           <w:numId w:val="3"/>
         </w:numPr>
+        <w:spacing w:before="40" w:after="40"/>
       </w:pPr>
       <w:r>
         <w:t>Inserisci il nome (es. Griglia, Bar, Fritti)</w:t>
@@ -1538,6 +1618,7 @@
           <w:ilvl w:val="0"/>
           <w:numId w:val="3"/>
         </w:numPr>
+        <w:spacing w:before="40" w:after="40"/>
       </w:pPr>
       <w:r>
         <w:t>Seleziona le famiglie di prodotti che appartengono a questa comanda</w:t>
@@ -1581,6 +1662,9 @@
       </w:r>
     </w:p>
     <w:p>
+      <w:pPr>
+        <w:spacing w:after="120"/>
+      </w:pPr>
       <w:r>
         <w:t>Gestisci l'elenco dei volontari e il valore del loro buono consumazione.</w:t>
       </w:r>
@@ -1592,6 +1676,7 @@
           <w:ilvl w:val="0"/>
           <w:numId w:val="3"/>
         </w:numPr>
+        <w:spacing w:before="40" w:after="40"/>
       </w:pPr>
       <w:r>
         <w:t xml:space="preserve">Vai su </w:t>
@@ -1610,6 +1695,7 @@
           <w:ilvl w:val="0"/>
           <w:numId w:val="3"/>
         </w:numPr>
+        <w:spacing w:before="40" w:after="40"/>
       </w:pPr>
       <w:r>
         <w:t xml:space="preserve">Clicca su </w:t>
@@ -1628,6 +1714,7 @@
           <w:ilvl w:val="0"/>
           <w:numId w:val="3"/>
         </w:numPr>
+        <w:spacing w:before="40" w:after="40"/>
       </w:pPr>
       <w:r>
         <w:t>Inserisci: nome e cognome, valore del buono (€), note opzionali</w:t>
@@ -1640,12 +1727,16 @@
           <w:ilvl w:val="0"/>
           <w:numId w:val="3"/>
         </w:numPr>
+        <w:spacing w:before="40" w:after="40"/>
       </w:pPr>
       <w:r>
         <w:t>Salva</w:t>
       </w:r>
     </w:p>
     <w:p>
+      <w:pPr>
+        <w:spacing w:after="120"/>
+      </w:pPr>
       <w:r>
         <w:t>Il valore del buono si azzera automaticamente a ogni chiusura cassa: ogni serata i volontari ripartono con il buono pieno.</w:t>
       </w:r>
@@ -1682,6 +1773,9 @@
       </w:r>
     </w:p>
     <w:p>
+      <w:pPr>
+        <w:spacing w:after="120"/>
+      </w:pPr>
       <w:r>
         <w:t xml:space="preserve">Puoi personalizzare l'aspetto dei pulsanti della cassa in </w:t>
       </w:r>
@@ -1702,6 +1796,7 @@
           <w:ilvl w:val="0"/>
           <w:numId w:val="2"/>
         </w:numPr>
+        <w:spacing w:before="40" w:after="40"/>
       </w:pPr>
       <w:r>
         <w:t>Dimensione del nome del prodotto e del prezzo</w:t>
@@ -1714,6 +1809,7 @@
           <w:ilvl w:val="0"/>
           <w:numId w:val="2"/>
         </w:numPr>
+        <w:spacing w:before="40" w:after="40"/>
       </w:pPr>
       <w:r>
         <w:t>Altezza, larghezza e spaziatura dei pulsanti</w:t>
@@ -1726,6 +1822,7 @@
           <w:ilvl w:val="0"/>
           <w:numId w:val="2"/>
         </w:numPr>
+        <w:spacing w:before="40" w:after="40"/>
       </w:pPr>
       <w:r>
         <w:t>Colore del testo</w:t>
@@ -1743,6 +1840,9 @@
       </w:r>
     </w:p>
     <w:p>
+      <w:pPr>
+        <w:spacing w:after="120"/>
+      </w:pPr>
       <w:r>
         <w:t>Per i prodotti che possono essere personalizzati dal cliente (es. hamburger, panini):</w:t>
       </w:r>
@@ -1754,6 +1854,7 @@
           <w:ilvl w:val="0"/>
           <w:numId w:val="3"/>
         </w:numPr>
+        <w:spacing w:before="40" w:after="40"/>
       </w:pPr>
       <w:r>
         <w:t xml:space="preserve">Vai su </w:t>
@@ -1775,6 +1876,7 @@
           <w:ilvl w:val="0"/>
           <w:numId w:val="3"/>
         </w:numPr>
+        <w:spacing w:before="40" w:after="40"/>
       </w:pPr>
       <w:r>
         <w:t xml:space="preserve">Nel campo </w:t>
@@ -1796,12 +1898,16 @@
           <w:ilvl w:val="0"/>
           <w:numId w:val="3"/>
         </w:numPr>
+        <w:spacing w:before="40" w:after="40"/>
       </w:pPr>
       <w:r>
         <w:t>Salva</w:t>
       </w:r>
     </w:p>
     <w:p>
+      <w:pPr>
+        <w:spacing w:after="120"/>
+      </w:pPr>
       <w:r>
         <w:t>In cassa, il pulsante 🔧 accanto al prodotto permette di selezionare gli ingredienti da escludere.</w:t>
       </w:r>
@@ -1818,6 +1924,9 @@
       </w:r>
     </w:p>
     <w:p>
+      <w:pPr>
+        <w:spacing w:after="120"/>
+      </w:pPr>
       <w:r>
         <w:t>Per ricevere il riepilogo di chiusura cassa via email con allegato Excel:</w:t>
       </w:r>
@@ -1829,6 +1938,7 @@
           <w:ilvl w:val="0"/>
           <w:numId w:val="3"/>
         </w:numPr>
+        <w:spacing w:before="40" w:after="40"/>
       </w:pPr>
       <w:r>
         <w:t xml:space="preserve">Vai su </w:t>
@@ -1847,6 +1957,7 @@
           <w:ilvl w:val="0"/>
           <w:numId w:val="3"/>
         </w:numPr>
+        <w:spacing w:before="40" w:after="40"/>
       </w:pPr>
       <w:r>
         <w:t xml:space="preserve">Nel campo </w:t>
@@ -1868,6 +1979,7 @@
           <w:ilvl w:val="0"/>
           <w:numId w:val="3"/>
         </w:numPr>
+        <w:spacing w:before="40" w:after="40"/>
       </w:pPr>
       <w:r>
         <w:t>Salva</w:t>
@@ -1919,6 +2031,7 @@
           <w:ilvl w:val="0"/>
           <w:numId w:val="3"/>
         </w:numPr>
+        <w:spacing w:before="40" w:after="40"/>
       </w:pPr>
       <w:r>
         <w:t>Seleziona il filtro di famiglia in alto per filtrare i prodotti</w:t>
@@ -1931,6 +2044,7 @@
           <w:ilvl w:val="0"/>
           <w:numId w:val="3"/>
         </w:numPr>
+        <w:spacing w:before="40" w:after="40"/>
       </w:pPr>
       <w:r>
         <w:t>Clicca sui pulsanti dei prodotti per aggiungerli allo scontrino</w:t>
@@ -1943,6 +2057,7 @@
           <w:ilvl w:val="0"/>
           <w:numId w:val="3"/>
         </w:numPr>
+        <w:spacing w:before="40" w:after="40"/>
       </w:pPr>
       <w:r>
         <w:t xml:space="preserve">Modifica le quantità con i pulsanti </w:t>
@@ -1970,6 +2085,7 @@
           <w:ilvl w:val="0"/>
           <w:numId w:val="3"/>
         </w:numPr>
+        <w:spacing w:before="40" w:after="40"/>
       </w:pPr>
       <w:r>
         <w:t>Per aggiungere una nota a una riga, fai doppio clic sul nome del prodotto</w:t>
@@ -1982,6 +2098,7 @@
           <w:ilvl w:val="0"/>
           <w:numId w:val="3"/>
         </w:numPr>
+        <w:spacing w:before="40" w:after="40"/>
       </w:pPr>
       <w:r>
         <w:t>Per personalizzare gli ingredienti, clicca il pulsante 🔧</w:t>
@@ -1994,6 +2111,7 @@
           <w:ilvl w:val="0"/>
           <w:numId w:val="3"/>
         </w:numPr>
+        <w:spacing w:before="40" w:after="40"/>
       </w:pPr>
       <w:r>
         <w:t xml:space="preserve">Per assegnare un numero tavolo, clicca il pulsante </w:t>
@@ -2015,6 +2133,7 @@
           <w:ilvl w:val="0"/>
           <w:numId w:val="3"/>
         </w:numPr>
+        <w:spacing w:before="40" w:after="40"/>
       </w:pPr>
       <w:r>
         <w:t xml:space="preserve">Per un ordine da asporto, attiva il toggle </w:t>
@@ -2033,6 +2152,7 @@
           <w:ilvl w:val="0"/>
           <w:numId w:val="3"/>
         </w:numPr>
+        <w:spacing w:before="40" w:after="40"/>
       </w:pPr>
       <w:r>
         <w:t xml:space="preserve">Se è presente un volontario, selezionalo nella sezione </w:t>
@@ -2054,6 +2174,7 @@
           <w:ilvl w:val="0"/>
           <w:numId w:val="3"/>
         </w:numPr>
+        <w:spacing w:before="40" w:after="40"/>
       </w:pPr>
       <w:r>
         <w:t xml:space="preserve">Clicca </w:t>
@@ -2086,6 +2207,9 @@
       </w:r>
     </w:p>
     <w:p>
+      <w:pPr>
+        <w:spacing w:after="120"/>
+      </w:pPr>
       <w:r>
         <w:t>I volontari hanno diritto a un buono consumazione per la serata. Per utilizzarlo:</w:t>
       </w:r>
@@ -2097,6 +2221,7 @@
           <w:ilvl w:val="0"/>
           <w:numId w:val="3"/>
         </w:numPr>
+        <w:spacing w:before="40" w:after="40"/>
       </w:pPr>
       <w:r>
         <w:t xml:space="preserve">Nel piede dello scontrino, trova la sezione </w:t>
@@ -2115,6 +2240,7 @@
           <w:ilvl w:val="0"/>
           <w:numId w:val="3"/>
         </w:numPr>
+        <w:spacing w:before="40" w:after="40"/>
       </w:pPr>
       <w:r>
         <w:t>Seleziona il volontario dal menu a tendina</w:t>
@@ -2127,6 +2253,7 @@
           <w:ilvl w:val="0"/>
           <w:numId w:val="3"/>
         </w:numPr>
+        <w:spacing w:before="40" w:after="40"/>
       </w:pPr>
       <w:r>
         <w:t xml:space="preserve">Viene mostrato automaticamente il </w:t>
@@ -2148,6 +2275,7 @@
           <w:ilvl w:val="0"/>
           <w:numId w:val="3"/>
         </w:numPr>
+        <w:spacing w:before="40" w:after="40"/>
       </w:pPr>
       <w:r>
         <w:t>Inserisci l'importo da scalare dal buono (non può superare il saldo disponibile né il totale dello scontrino)</w:t>
@@ -2160,12 +2288,16 @@
           <w:ilvl w:val="0"/>
           <w:numId w:val="3"/>
         </w:numPr>
+        <w:spacing w:before="40" w:after="40"/>
       </w:pPr>
       <w:r>
         <w:t>Il totale da pagare si aggiorna in tempo reale</w:t>
       </w:r>
     </w:p>
     <w:p>
+      <w:pPr>
+        <w:spacing w:after="120"/>
+      </w:pPr>
       <w:r>
         <w:rPr>
           <w:b/>
@@ -2177,6 +2309,9 @@
       </w:r>
     </w:p>
     <w:p>
+      <w:pPr>
+        <w:spacing w:after="120"/>
+      </w:pPr>
       <w:r>
         <w:rPr>
           <w:b/>
@@ -2219,6 +2354,9 @@
       </w:r>
     </w:p>
     <w:p>
+      <w:pPr>
+        <w:spacing w:after="120"/>
+      </w:pPr>
       <w:r>
         <w:t xml:space="preserve">Cliccando </w:t>
       </w:r>
@@ -2242,6 +2380,9 @@
       </w:r>
     </w:p>
     <w:p>
+      <w:pPr>
+        <w:spacing w:after="40"/>
+      </w:pPr>
       <w:r>
         <w:rPr>
           <w:b/>
@@ -2250,11 +2391,17 @@
       </w:r>
     </w:p>
     <w:p>
+      <w:pPr>
+        <w:spacing w:after="120"/>
+      </w:pPr>
       <w:r>
         <w:t>Clicca sui pulsanti delle banconote e monete per comporre l'importo ricevuto. Il sistema calcola automaticamente il resto. Puoi anche digitare l'importo o lasciare il campo vuoto per registrare come pagamento esatto.</w:t>
       </w:r>
     </w:p>
     <w:p>
+      <w:pPr>
+        <w:spacing w:after="40"/>
+      </w:pPr>
       <w:r>
         <w:rPr>
           <w:b/>
@@ -2263,11 +2410,17 @@
       </w:r>
     </w:p>
     <w:p>
+      <w:pPr>
+        <w:spacing w:after="120"/>
+      </w:pPr>
       <w:r>
         <w:t>Registra il pagamento con carta. L'importo è automaticamente quello del totale.</w:t>
       </w:r>
     </w:p>
     <w:p>
+      <w:pPr>
+        <w:spacing w:after="120"/>
+      </w:pPr>
       <w:r>
         <w:rPr>
           <w:b/>
@@ -2285,11 +2438,17 @@
       </w:r>
     </w:p>
     <w:p>
+      <w:pPr>
+        <w:spacing w:after="120"/>
+      </w:pPr>
       <w:r>
         <w:t>Registra il pagamento tramite Satispay. Viene tracciato separatamente nelle statistiche.</w:t>
       </w:r>
     </w:p>
     <w:p>
+      <w:pPr>
+        <w:spacing w:after="40"/>
+      </w:pPr>
       <w:r>
         <w:rPr>
           <w:b/>
@@ -2298,6 +2457,9 @@
       </w:r>
     </w:p>
     <w:p>
+      <w:pPr>
+        <w:spacing w:after="120"/>
+      </w:pPr>
       <w:r>
         <w:t>Registra l'articolo come omaggio. Il totale diventa zero.</w:t>
       </w:r>
@@ -2334,6 +2496,9 @@
       </w:r>
     </w:p>
     <w:p>
+      <w:pPr>
+        <w:spacing w:after="120"/>
+      </w:pPr>
       <w:r>
         <w:t xml:space="preserve">Il pulsante </w:t>
       </w:r>
@@ -2354,6 +2519,7 @@
           <w:ilvl w:val="0"/>
           <w:numId w:val="2"/>
         </w:numPr>
+        <w:spacing w:before="40" w:after="40"/>
       </w:pPr>
       <w:r>
         <w:t>Visualizzare le righe di ogni scontrino</w:t>
@@ -2366,6 +2532,7 @@
           <w:ilvl w:val="0"/>
           <w:numId w:val="2"/>
         </w:numPr>
+        <w:spacing w:before="40" w:after="40"/>
       </w:pPr>
       <w:r>
         <w:t>Rimuovere singole righe da uno scontrino</w:t>
@@ -2378,6 +2545,7 @@
           <w:ilvl w:val="0"/>
           <w:numId w:val="2"/>
         </w:numPr>
+        <w:spacing w:before="40" w:after="40"/>
       </w:pPr>
       <w:r>
         <w:t>Modificare le quantità</w:t>
@@ -2390,6 +2558,7 @@
           <w:ilvl w:val="0"/>
           <w:numId w:val="2"/>
         </w:numPr>
+        <w:spacing w:before="40" w:after="40"/>
       </w:pPr>
       <w:r>
         <w:t>Stornare completamente uno scontrino</w:t>
@@ -2402,6 +2571,7 @@
           <w:ilvl w:val="0"/>
           <w:numId w:val="2"/>
         </w:numPr>
+        <w:spacing w:before="40" w:after="40"/>
       </w:pPr>
       <w:r>
         <w:t>Applicare uno sconto post-vendita</w:t>
@@ -2414,6 +2584,7 @@
           <w:ilvl w:val="0"/>
           <w:numId w:val="2"/>
         </w:numPr>
+        <w:spacing w:before="40" w:after="40"/>
       </w:pPr>
       <w:r>
         <w:t xml:space="preserve">Ristampare uno scontrino con il pulsante </w:t>
@@ -2432,6 +2603,7 @@
           <w:ilvl w:val="0"/>
           <w:numId w:val="2"/>
         </w:numPr>
+        <w:spacing w:before="40" w:after="40"/>
       </w:pPr>
       <w:r>
         <w:t>Impostare o rimuovere l'omaggio su singole righe</w:t>
@@ -2444,6 +2616,7 @@
           <w:ilvl w:val="0"/>
           <w:numId w:val="2"/>
         </w:numPr>
+        <w:spacing w:before="40" w:after="40"/>
       </w:pPr>
       <w:r>
         <w:rPr>
@@ -2490,6 +2663,9 @@
       </w:r>
     </w:p>
     <w:p>
+      <w:pPr>
+        <w:spacing w:after="120"/>
+      </w:pPr>
       <w:r>
         <w:t xml:space="preserve">La pagina </w:t>
       </w:r>
@@ -2533,8 +2709,6 @@
               <w:left w:val="single" w:sz="1" w:space="0" w:color="CCCCCC"/>
               <w:bottom w:val="single" w:sz="1" w:space="0" w:color="CCCCCC"/>
               <w:right w:val="single" w:sz="1" w:space="0" w:color="CCCCCC"/>
-              <w:insideH w:val="single" w:sz="1" w:space="0" w:color="CCCCCC"/>
-              <w:insideV w:val="single" w:sz="1" w:space="0" w:color="CCCCCC"/>
             </w:tcBorders>
             <w:shd w:val="clear" w:color="auto" w:fill="F5F5F5"/>
           </w:tcPr>
@@ -2562,8 +2736,6 @@
               <w:left w:val="single" w:sz="1" w:space="0" w:color="CCCCCC"/>
               <w:bottom w:val="single" w:sz="1" w:space="0" w:color="CCCCCC"/>
               <w:right w:val="single" w:sz="1" w:space="0" w:color="CCCCCC"/>
-              <w:insideH w:val="single" w:sz="1" w:space="0" w:color="CCCCCC"/>
-              <w:insideV w:val="single" w:sz="1" w:space="0" w:color="CCCCCC"/>
             </w:tcBorders>
             <w:shd w:val="clear" w:color="auto" w:fill="F5F5F5"/>
           </w:tcPr>
@@ -2593,8 +2765,6 @@
               <w:left w:val="single" w:sz="1" w:space="0" w:color="CCCCCC"/>
               <w:bottom w:val="single" w:sz="1" w:space="0" w:color="CCCCCC"/>
               <w:right w:val="single" w:sz="1" w:space="0" w:color="CCCCCC"/>
-              <w:insideH w:val="single" w:sz="1" w:space="0" w:color="CCCCCC"/>
-              <w:insideV w:val="single" w:sz="1" w:space="0" w:color="CCCCCC"/>
             </w:tcBorders>
             <w:shd w:val="clear" w:color="auto" w:fill="F9FAFB"/>
           </w:tcPr>
@@ -2613,8 +2783,6 @@
               <w:left w:val="single" w:sz="1" w:space="0" w:color="CCCCCC"/>
               <w:bottom w:val="single" w:sz="1" w:space="0" w:color="CCCCCC"/>
               <w:right w:val="single" w:sz="1" w:space="0" w:color="CCCCCC"/>
-              <w:insideH w:val="single" w:sz="1" w:space="0" w:color="CCCCCC"/>
-              <w:insideV w:val="single" w:sz="1" w:space="0" w:color="CCCCCC"/>
             </w:tcBorders>
             <w:shd w:val="clear" w:color="auto" w:fill="F9FAFB"/>
           </w:tcPr>
@@ -2635,8 +2803,6 @@
               <w:left w:val="single" w:sz="1" w:space="0" w:color="CCCCCC"/>
               <w:bottom w:val="single" w:sz="1" w:space="0" w:color="CCCCCC"/>
               <w:right w:val="single" w:sz="1" w:space="0" w:color="CCCCCC"/>
-              <w:insideH w:val="single" w:sz="1" w:space="0" w:color="CCCCCC"/>
-              <w:insideV w:val="single" w:sz="1" w:space="0" w:color="CCCCCC"/>
             </w:tcBorders>
           </w:tcPr>
           <w:p>
@@ -2654,8 +2820,6 @@
               <w:left w:val="single" w:sz="1" w:space="0" w:color="CCCCCC"/>
               <w:bottom w:val="single" w:sz="1" w:space="0" w:color="CCCCCC"/>
               <w:right w:val="single" w:sz="1" w:space="0" w:color="CCCCCC"/>
-              <w:insideH w:val="single" w:sz="1" w:space="0" w:color="CCCCCC"/>
-              <w:insideV w:val="single" w:sz="1" w:space="0" w:color="CCCCCC"/>
             </w:tcBorders>
           </w:tcPr>
           <w:p>
@@ -2675,8 +2839,6 @@
               <w:left w:val="single" w:sz="1" w:space="0" w:color="CCCCCC"/>
               <w:bottom w:val="single" w:sz="1" w:space="0" w:color="CCCCCC"/>
               <w:right w:val="single" w:sz="1" w:space="0" w:color="CCCCCC"/>
-              <w:insideH w:val="single" w:sz="1" w:space="0" w:color="CCCCCC"/>
-              <w:insideV w:val="single" w:sz="1" w:space="0" w:color="CCCCCC"/>
             </w:tcBorders>
             <w:shd w:val="clear" w:color="auto" w:fill="F9FAFB"/>
           </w:tcPr>
@@ -2695,8 +2857,6 @@
               <w:left w:val="single" w:sz="1" w:space="0" w:color="CCCCCC"/>
               <w:bottom w:val="single" w:sz="1" w:space="0" w:color="CCCCCC"/>
               <w:right w:val="single" w:sz="1" w:space="0" w:color="CCCCCC"/>
-              <w:insideH w:val="single" w:sz="1" w:space="0" w:color="CCCCCC"/>
-              <w:insideV w:val="single" w:sz="1" w:space="0" w:color="CCCCCC"/>
             </w:tcBorders>
             <w:shd w:val="clear" w:color="auto" w:fill="F9FAFB"/>
           </w:tcPr>
@@ -2717,8 +2877,6 @@
               <w:left w:val="single" w:sz="1" w:space="0" w:color="CCCCCC"/>
               <w:bottom w:val="single" w:sz="1" w:space="0" w:color="CCCCCC"/>
               <w:right w:val="single" w:sz="1" w:space="0" w:color="CCCCCC"/>
-              <w:insideH w:val="single" w:sz="1" w:space="0" w:color="CCCCCC"/>
-              <w:insideV w:val="single" w:sz="1" w:space="0" w:color="CCCCCC"/>
             </w:tcBorders>
           </w:tcPr>
           <w:p>
@@ -2736,8 +2894,6 @@
               <w:left w:val="single" w:sz="1" w:space="0" w:color="CCCCCC"/>
               <w:bottom w:val="single" w:sz="1" w:space="0" w:color="CCCCCC"/>
               <w:right w:val="single" w:sz="1" w:space="0" w:color="CCCCCC"/>
-              <w:insideH w:val="single" w:sz="1" w:space="0" w:color="CCCCCC"/>
-              <w:insideV w:val="single" w:sz="1" w:space="0" w:color="CCCCCC"/>
             </w:tcBorders>
           </w:tcPr>
           <w:p>
@@ -2757,8 +2913,6 @@
               <w:left w:val="single" w:sz="1" w:space="0" w:color="CCCCCC"/>
               <w:bottom w:val="single" w:sz="1" w:space="0" w:color="CCCCCC"/>
               <w:right w:val="single" w:sz="1" w:space="0" w:color="CCCCCC"/>
-              <w:insideH w:val="single" w:sz="1" w:space="0" w:color="CCCCCC"/>
-              <w:insideV w:val="single" w:sz="1" w:space="0" w:color="CCCCCC"/>
             </w:tcBorders>
             <w:shd w:val="clear" w:color="auto" w:fill="F9FAFB"/>
           </w:tcPr>
@@ -2777,8 +2931,6 @@
               <w:left w:val="single" w:sz="1" w:space="0" w:color="CCCCCC"/>
               <w:bottom w:val="single" w:sz="1" w:space="0" w:color="CCCCCC"/>
               <w:right w:val="single" w:sz="1" w:space="0" w:color="CCCCCC"/>
-              <w:insideH w:val="single" w:sz="1" w:space="0" w:color="CCCCCC"/>
-              <w:insideV w:val="single" w:sz="1" w:space="0" w:color="CCCCCC"/>
             </w:tcBorders>
             <w:shd w:val="clear" w:color="auto" w:fill="F9FAFB"/>
           </w:tcPr>
@@ -2799,8 +2951,6 @@
               <w:left w:val="single" w:sz="1" w:space="0" w:color="CCCCCC"/>
               <w:bottom w:val="single" w:sz="1" w:space="0" w:color="CCCCCC"/>
               <w:right w:val="single" w:sz="1" w:space="0" w:color="CCCCCC"/>
-              <w:insideH w:val="single" w:sz="1" w:space="0" w:color="CCCCCC"/>
-              <w:insideV w:val="single" w:sz="1" w:space="0" w:color="CCCCCC"/>
             </w:tcBorders>
           </w:tcPr>
           <w:p>
@@ -2818,8 +2968,6 @@
               <w:left w:val="single" w:sz="1" w:space="0" w:color="CCCCCC"/>
               <w:bottom w:val="single" w:sz="1" w:space="0" w:color="CCCCCC"/>
               <w:right w:val="single" w:sz="1" w:space="0" w:color="CCCCCC"/>
-              <w:insideH w:val="single" w:sz="1" w:space="0" w:color="CCCCCC"/>
-              <w:insideV w:val="single" w:sz="1" w:space="0" w:color="CCCCCC"/>
             </w:tcBorders>
           </w:tcPr>
           <w:p>
@@ -2843,6 +2991,9 @@
       </w:r>
     </w:p>
     <w:p>
+      <w:pPr>
+        <w:spacing w:after="120"/>
+      </w:pPr>
       <w:r>
         <w:t xml:space="preserve">Quando un ordine è pronto, premi il pulsante verde </w:t>
       </w:r>
@@ -2877,6 +3028,9 @@
       </w:r>
     </w:p>
     <w:p>
+      <w:pPr>
+        <w:spacing w:after="120"/>
+      </w:pPr>
       <w:r>
         <w:t>Ogni riga di una comanda ha una checkbox per segnare i singoli prodotti come pronti. Le checkbox sono sincronizzate in tempo reale tra tutti i dispositivi.</w:t>
       </w:r>
@@ -2899,6 +3053,7 @@
           <w:ilvl w:val="0"/>
           <w:numId w:val="2"/>
         </w:numPr>
+        <w:spacing w:before="40" w:after="40"/>
       </w:pPr>
       <w:r>
         <w:rPr>
@@ -2917,6 +3072,7 @@
           <w:ilvl w:val="0"/>
           <w:numId w:val="2"/>
         </w:numPr>
+        <w:spacing w:before="40" w:after="40"/>
       </w:pPr>
       <w:r>
         <w:rPr>
@@ -2937,6 +3093,9 @@
       </w:r>
     </w:p>
     <w:p>
+      <w:pPr>
+        <w:spacing w:after="120"/>
+      </w:pPr>
       <w:r>
         <w:t xml:space="preserve">La pagina </w:t>
       </w:r>
@@ -2962,6 +3121,9 @@
       </w:r>
     </w:p>
     <w:p>
+      <w:pPr>
+        <w:spacing w:after="120"/>
+      </w:pPr>
       <w:r>
         <w:rPr>
           <w:b/>
@@ -2973,6 +3135,9 @@
       </w:r>
     </w:p>
     <w:p>
+      <w:pPr>
+        <w:spacing w:after="120"/>
+      </w:pPr>
       <w:r>
         <w:rPr>
           <w:b/>
@@ -2984,6 +3149,9 @@
       </w:r>
     </w:p>
     <w:p>
+      <w:pPr>
+        <w:spacing w:after="120"/>
+      </w:pPr>
       <w:r>
         <w:rPr>
           <w:b/>
@@ -3006,6 +3174,9 @@
       </w:r>
     </w:p>
     <w:p>
+      <w:pPr>
+        <w:spacing w:after="120"/>
+      </w:pPr>
       <w:r>
         <w:rPr>
           <w:b/>
@@ -3017,6 +3188,9 @@
       </w:r>
     </w:p>
     <w:p>
+      <w:pPr>
+        <w:spacing w:after="120"/>
+      </w:pPr>
       <w:r>
         <w:rPr>
           <w:b/>
@@ -3036,6 +3210,9 @@
       </w:r>
     </w:p>
     <w:p>
+      <w:pPr>
+        <w:spacing w:after="120"/>
+      </w:pPr>
       <w:r>
         <w:t xml:space="preserve">La pagina </w:t>
       </w:r>
@@ -3094,11 +3271,17 @@
       </w:r>
     </w:p>
     <w:p>
+      <w:pPr>
+        <w:spacing w:after="120"/>
+      </w:pPr>
       <w:r>
         <w:t>In cima alla pagina sono disponibili pulsanti rapidi per filtrare gli scontrini per metodo di pagamento:</w:t>
       </w:r>
     </w:p>
     <w:p>
+      <w:pPr>
+        <w:spacing w:after="40"/>
+      </w:pPr>
       <w:r>
         <w:rPr>
           <w:b/>
@@ -3136,8 +3319,6 @@
               <w:left w:val="single" w:sz="1" w:space="0" w:color="CCCCCC"/>
               <w:bottom w:val="single" w:sz="1" w:space="0" w:color="CCCCCC"/>
               <w:right w:val="single" w:sz="1" w:space="0" w:color="CCCCCC"/>
-              <w:insideH w:val="single" w:sz="1" w:space="0" w:color="CCCCCC"/>
-              <w:insideV w:val="single" w:sz="1" w:space="0" w:color="CCCCCC"/>
             </w:tcBorders>
             <w:shd w:val="clear" w:color="auto" w:fill="F5F5F5"/>
           </w:tcPr>
@@ -3165,8 +3346,6 @@
               <w:left w:val="single" w:sz="1" w:space="0" w:color="CCCCCC"/>
               <w:bottom w:val="single" w:sz="1" w:space="0" w:color="CCCCCC"/>
               <w:right w:val="single" w:sz="1" w:space="0" w:color="CCCCCC"/>
-              <w:insideH w:val="single" w:sz="1" w:space="0" w:color="CCCCCC"/>
-              <w:insideV w:val="single" w:sz="1" w:space="0" w:color="CCCCCC"/>
             </w:tcBorders>
             <w:shd w:val="clear" w:color="auto" w:fill="F5F5F5"/>
           </w:tcPr>
@@ -3196,8 +3375,6 @@
               <w:left w:val="single" w:sz="1" w:space="0" w:color="CCCCCC"/>
               <w:bottom w:val="single" w:sz="1" w:space="0" w:color="CCCCCC"/>
               <w:right w:val="single" w:sz="1" w:space="0" w:color="CCCCCC"/>
-              <w:insideH w:val="single" w:sz="1" w:space="0" w:color="CCCCCC"/>
-              <w:insideV w:val="single" w:sz="1" w:space="0" w:color="CCCCCC"/>
             </w:tcBorders>
             <w:shd w:val="clear" w:color="auto" w:fill="F9FAFB"/>
           </w:tcPr>
@@ -3219,8 +3396,6 @@
               <w:left w:val="single" w:sz="1" w:space="0" w:color="CCCCCC"/>
               <w:bottom w:val="single" w:sz="1" w:space="0" w:color="CCCCCC"/>
               <w:right w:val="single" w:sz="1" w:space="0" w:color="CCCCCC"/>
-              <w:insideH w:val="single" w:sz="1" w:space="0" w:color="CCCCCC"/>
-              <w:insideV w:val="single" w:sz="1" w:space="0" w:color="CCCCCC"/>
             </w:tcBorders>
             <w:shd w:val="clear" w:color="auto" w:fill="F9FAFB"/>
           </w:tcPr>
@@ -3241,8 +3416,6 @@
               <w:left w:val="single" w:sz="1" w:space="0" w:color="CCCCCC"/>
               <w:bottom w:val="single" w:sz="1" w:space="0" w:color="CCCCCC"/>
               <w:right w:val="single" w:sz="1" w:space="0" w:color="CCCCCC"/>
-              <w:insideH w:val="single" w:sz="1" w:space="0" w:color="CCCCCC"/>
-              <w:insideV w:val="single" w:sz="1" w:space="0" w:color="CCCCCC"/>
             </w:tcBorders>
           </w:tcPr>
           <w:p>
@@ -3260,8 +3433,6 @@
               <w:left w:val="single" w:sz="1" w:space="0" w:color="CCCCCC"/>
               <w:bottom w:val="single" w:sz="1" w:space="0" w:color="CCCCCC"/>
               <w:right w:val="single" w:sz="1" w:space="0" w:color="CCCCCC"/>
-              <w:insideH w:val="single" w:sz="1" w:space="0" w:color="CCCCCC"/>
-              <w:insideV w:val="single" w:sz="1" w:space="0" w:color="CCCCCC"/>
             </w:tcBorders>
           </w:tcPr>
           <w:p>
@@ -3281,8 +3452,6 @@
               <w:left w:val="single" w:sz="1" w:space="0" w:color="CCCCCC"/>
               <w:bottom w:val="single" w:sz="1" w:space="0" w:color="CCCCCC"/>
               <w:right w:val="single" w:sz="1" w:space="0" w:color="CCCCCC"/>
-              <w:insideH w:val="single" w:sz="1" w:space="0" w:color="CCCCCC"/>
-              <w:insideV w:val="single" w:sz="1" w:space="0" w:color="CCCCCC"/>
             </w:tcBorders>
             <w:shd w:val="clear" w:color="auto" w:fill="F9FAFB"/>
           </w:tcPr>
@@ -3301,8 +3470,6 @@
               <w:left w:val="single" w:sz="1" w:space="0" w:color="CCCCCC"/>
               <w:bottom w:val="single" w:sz="1" w:space="0" w:color="CCCCCC"/>
               <w:right w:val="single" w:sz="1" w:space="0" w:color="CCCCCC"/>
-              <w:insideH w:val="single" w:sz="1" w:space="0" w:color="CCCCCC"/>
-              <w:insideV w:val="single" w:sz="1" w:space="0" w:color="CCCCCC"/>
             </w:tcBorders>
             <w:shd w:val="clear" w:color="auto" w:fill="F9FAFB"/>
           </w:tcPr>
@@ -3323,8 +3490,6 @@
               <w:left w:val="single" w:sz="1" w:space="0" w:color="CCCCCC"/>
               <w:bottom w:val="single" w:sz="1" w:space="0" w:color="CCCCCC"/>
               <w:right w:val="single" w:sz="1" w:space="0" w:color="CCCCCC"/>
-              <w:insideH w:val="single" w:sz="1" w:space="0" w:color="CCCCCC"/>
-              <w:insideV w:val="single" w:sz="1" w:space="0" w:color="CCCCCC"/>
             </w:tcBorders>
           </w:tcPr>
           <w:p>
@@ -3342,8 +3507,6 @@
               <w:left w:val="single" w:sz="1" w:space="0" w:color="CCCCCC"/>
               <w:bottom w:val="single" w:sz="1" w:space="0" w:color="CCCCCC"/>
               <w:right w:val="single" w:sz="1" w:space="0" w:color="CCCCCC"/>
-              <w:insideH w:val="single" w:sz="1" w:space="0" w:color="CCCCCC"/>
-              <w:insideV w:val="single" w:sz="1" w:space="0" w:color="CCCCCC"/>
             </w:tcBorders>
           </w:tcPr>
           <w:p>
@@ -3363,8 +3526,6 @@
               <w:left w:val="single" w:sz="1" w:space="0" w:color="CCCCCC"/>
               <w:bottom w:val="single" w:sz="1" w:space="0" w:color="CCCCCC"/>
               <w:right w:val="single" w:sz="1" w:space="0" w:color="CCCCCC"/>
-              <w:insideH w:val="single" w:sz="1" w:space="0" w:color="CCCCCC"/>
-              <w:insideV w:val="single" w:sz="1" w:space="0" w:color="CCCCCC"/>
             </w:tcBorders>
             <w:shd w:val="clear" w:color="auto" w:fill="F9FAFB"/>
           </w:tcPr>
@@ -3383,8 +3544,6 @@
               <w:left w:val="single" w:sz="1" w:space="0" w:color="CCCCCC"/>
               <w:bottom w:val="single" w:sz="1" w:space="0" w:color="CCCCCC"/>
               <w:right w:val="single" w:sz="1" w:space="0" w:color="CCCCCC"/>
-              <w:insideH w:val="single" w:sz="1" w:space="0" w:color="CCCCCC"/>
-              <w:insideV w:val="single" w:sz="1" w:space="0" w:color="CCCCCC"/>
             </w:tcBorders>
             <w:shd w:val="clear" w:color="auto" w:fill="F9FAFB"/>
           </w:tcPr>
@@ -3405,8 +3564,6 @@
               <w:left w:val="single" w:sz="1" w:space="0" w:color="CCCCCC"/>
               <w:bottom w:val="single" w:sz="1" w:space="0" w:color="CCCCCC"/>
               <w:right w:val="single" w:sz="1" w:space="0" w:color="CCCCCC"/>
-              <w:insideH w:val="single" w:sz="1" w:space="0" w:color="CCCCCC"/>
-              <w:insideV w:val="single" w:sz="1" w:space="0" w:color="CCCCCC"/>
             </w:tcBorders>
           </w:tcPr>
           <w:p>
@@ -3424,8 +3581,6 @@
               <w:left w:val="single" w:sz="1" w:space="0" w:color="CCCCCC"/>
               <w:bottom w:val="single" w:sz="1" w:space="0" w:color="CCCCCC"/>
               <w:right w:val="single" w:sz="1" w:space="0" w:color="CCCCCC"/>
-              <w:insideH w:val="single" w:sz="1" w:space="0" w:color="CCCCCC"/>
-              <w:insideV w:val="single" w:sz="1" w:space="0" w:color="CCCCCC"/>
             </w:tcBorders>
           </w:tcPr>
           <w:p>
@@ -3445,8 +3600,6 @@
               <w:left w:val="single" w:sz="1" w:space="0" w:color="CCCCCC"/>
               <w:bottom w:val="single" w:sz="1" w:space="0" w:color="CCCCCC"/>
               <w:right w:val="single" w:sz="1" w:space="0" w:color="CCCCCC"/>
-              <w:insideH w:val="single" w:sz="1" w:space="0" w:color="CCCCCC"/>
-              <w:insideV w:val="single" w:sz="1" w:space="0" w:color="CCCCCC"/>
             </w:tcBorders>
             <w:shd w:val="clear" w:color="auto" w:fill="F9FAFB"/>
           </w:tcPr>
@@ -3468,8 +3621,6 @@
               <w:left w:val="single" w:sz="1" w:space="0" w:color="CCCCCC"/>
               <w:bottom w:val="single" w:sz="1" w:space="0" w:color="CCCCCC"/>
               <w:right w:val="single" w:sz="1" w:space="0" w:color="CCCCCC"/>
-              <w:insideH w:val="single" w:sz="1" w:space="0" w:color="CCCCCC"/>
-              <w:insideV w:val="single" w:sz="1" w:space="0" w:color="CCCCCC"/>
             </w:tcBorders>
             <w:shd w:val="clear" w:color="auto" w:fill="F9FAFB"/>
           </w:tcPr>
@@ -3490,8 +3641,6 @@
               <w:left w:val="single" w:sz="1" w:space="0" w:color="CCCCCC"/>
               <w:bottom w:val="single" w:sz="1" w:space="0" w:color="CCCCCC"/>
               <w:right w:val="single" w:sz="1" w:space="0" w:color="CCCCCC"/>
-              <w:insideH w:val="single" w:sz="1" w:space="0" w:color="CCCCCC"/>
-              <w:insideV w:val="single" w:sz="1" w:space="0" w:color="CCCCCC"/>
             </w:tcBorders>
           </w:tcPr>
           <w:p>
@@ -3509,8 +3658,6 @@
               <w:left w:val="single" w:sz="1" w:space="0" w:color="CCCCCC"/>
               <w:bottom w:val="single" w:sz="1" w:space="0" w:color="CCCCCC"/>
               <w:right w:val="single" w:sz="1" w:space="0" w:color="CCCCCC"/>
-              <w:insideH w:val="single" w:sz="1" w:space="0" w:color="CCCCCC"/>
-              <w:insideV w:val="single" w:sz="1" w:space="0" w:color="CCCCCC"/>
             </w:tcBorders>
           </w:tcPr>
           <w:p>
@@ -3530,8 +3677,6 @@
               <w:left w:val="single" w:sz="1" w:space="0" w:color="CCCCCC"/>
               <w:bottom w:val="single" w:sz="1" w:space="0" w:color="CCCCCC"/>
               <w:right w:val="single" w:sz="1" w:space="0" w:color="CCCCCC"/>
-              <w:insideH w:val="single" w:sz="1" w:space="0" w:color="CCCCCC"/>
-              <w:insideV w:val="single" w:sz="1" w:space="0" w:color="CCCCCC"/>
             </w:tcBorders>
             <w:shd w:val="clear" w:color="auto" w:fill="F9FAFB"/>
           </w:tcPr>
@@ -3550,8 +3695,6 @@
               <w:left w:val="single" w:sz="1" w:space="0" w:color="CCCCCC"/>
               <w:bottom w:val="single" w:sz="1" w:space="0" w:color="CCCCCC"/>
               <w:right w:val="single" w:sz="1" w:space="0" w:color="CCCCCC"/>
-              <w:insideH w:val="single" w:sz="1" w:space="0" w:color="CCCCCC"/>
-              <w:insideV w:val="single" w:sz="1" w:space="0" w:color="CCCCCC"/>
             </w:tcBorders>
             <w:shd w:val="clear" w:color="auto" w:fill="F9FAFB"/>
           </w:tcPr>
@@ -3596,6 +3739,9 @@
       </w:r>
     </w:p>
     <w:p>
+      <w:pPr>
+        <w:spacing w:after="120"/>
+      </w:pPr>
       <w:r>
         <w:t>Tabella con quantità, omaggi e incasso per ogni prodotto.</w:t>
       </w:r>
@@ -3612,6 +3758,9 @@
       </w:r>
     </w:p>
     <w:p>
+      <w:pPr>
+        <w:spacing w:after="120"/>
+      </w:pPr>
       <w:r>
         <w:t>Elenco di tutti gli scontrini con: numero, data/ora, operatore, lordo, buono usato, netto, metodo di pagamento, stato.</w:t>
       </w:r>
@@ -3628,6 +3777,9 @@
       </w:r>
     </w:p>
     <w:p>
+      <w:pPr>
+        <w:spacing w:after="120"/>
+      </w:pPr>
       <w:r>
         <w:t xml:space="preserve">Il pulsante </w:t>
       </w:r>
@@ -3660,8 +3812,6 @@
               <w:left w:val="single" w:sz="1" w:space="0" w:color="CCCCCC"/>
               <w:bottom w:val="single" w:sz="1" w:space="0" w:color="CCCCCC"/>
               <w:right w:val="single" w:sz="1" w:space="0" w:color="CCCCCC"/>
-              <w:insideH w:val="single" w:sz="1" w:space="0" w:color="CCCCCC"/>
-              <w:insideV w:val="single" w:sz="1" w:space="0" w:color="CCCCCC"/>
             </w:tcBorders>
             <w:shd w:val="clear" w:color="auto" w:fill="F5F5F5"/>
           </w:tcPr>
@@ -3689,8 +3839,6 @@
               <w:left w:val="single" w:sz="1" w:space="0" w:color="CCCCCC"/>
               <w:bottom w:val="single" w:sz="1" w:space="0" w:color="CCCCCC"/>
               <w:right w:val="single" w:sz="1" w:space="0" w:color="CCCCCC"/>
-              <w:insideH w:val="single" w:sz="1" w:space="0" w:color="CCCCCC"/>
-              <w:insideV w:val="single" w:sz="1" w:space="0" w:color="CCCCCC"/>
             </w:tcBorders>
             <w:shd w:val="clear" w:color="auto" w:fill="F5F5F5"/>
           </w:tcPr>
@@ -3720,8 +3868,6 @@
               <w:left w:val="single" w:sz="1" w:space="0" w:color="CCCCCC"/>
               <w:bottom w:val="single" w:sz="1" w:space="0" w:color="CCCCCC"/>
               <w:right w:val="single" w:sz="1" w:space="0" w:color="CCCCCC"/>
-              <w:insideH w:val="single" w:sz="1" w:space="0" w:color="CCCCCC"/>
-              <w:insideV w:val="single" w:sz="1" w:space="0" w:color="CCCCCC"/>
             </w:tcBorders>
             <w:shd w:val="clear" w:color="auto" w:fill="F9FAFB"/>
           </w:tcPr>
@@ -3743,8 +3889,6 @@
               <w:left w:val="single" w:sz="1" w:space="0" w:color="CCCCCC"/>
               <w:bottom w:val="single" w:sz="1" w:space="0" w:color="CCCCCC"/>
               <w:right w:val="single" w:sz="1" w:space="0" w:color="CCCCCC"/>
-              <w:insideH w:val="single" w:sz="1" w:space="0" w:color="CCCCCC"/>
-              <w:insideV w:val="single" w:sz="1" w:space="0" w:color="CCCCCC"/>
             </w:tcBorders>
             <w:shd w:val="clear" w:color="auto" w:fill="F9FAFB"/>
           </w:tcPr>
@@ -3765,8 +3909,6 @@
               <w:left w:val="single" w:sz="1" w:space="0" w:color="CCCCCC"/>
               <w:bottom w:val="single" w:sz="1" w:space="0" w:color="CCCCCC"/>
               <w:right w:val="single" w:sz="1" w:space="0" w:color="CCCCCC"/>
-              <w:insideH w:val="single" w:sz="1" w:space="0" w:color="CCCCCC"/>
-              <w:insideV w:val="single" w:sz="1" w:space="0" w:color="CCCCCC"/>
             </w:tcBorders>
           </w:tcPr>
           <w:p>
@@ -3787,8 +3929,6 @@
               <w:left w:val="single" w:sz="1" w:space="0" w:color="CCCCCC"/>
               <w:bottom w:val="single" w:sz="1" w:space="0" w:color="CCCCCC"/>
               <w:right w:val="single" w:sz="1" w:space="0" w:color="CCCCCC"/>
-              <w:insideH w:val="single" w:sz="1" w:space="0" w:color="CCCCCC"/>
-              <w:insideV w:val="single" w:sz="1" w:space="0" w:color="CCCCCC"/>
             </w:tcBorders>
           </w:tcPr>
           <w:p>
@@ -3808,8 +3948,6 @@
               <w:left w:val="single" w:sz="1" w:space="0" w:color="CCCCCC"/>
               <w:bottom w:val="single" w:sz="1" w:space="0" w:color="CCCCCC"/>
               <w:right w:val="single" w:sz="1" w:space="0" w:color="CCCCCC"/>
-              <w:insideH w:val="single" w:sz="1" w:space="0" w:color="CCCCCC"/>
-              <w:insideV w:val="single" w:sz="1" w:space="0" w:color="CCCCCC"/>
             </w:tcBorders>
             <w:shd w:val="clear" w:color="auto" w:fill="F9FAFB"/>
           </w:tcPr>
@@ -3831,8 +3969,6 @@
               <w:left w:val="single" w:sz="1" w:space="0" w:color="CCCCCC"/>
               <w:bottom w:val="single" w:sz="1" w:space="0" w:color="CCCCCC"/>
               <w:right w:val="single" w:sz="1" w:space="0" w:color="CCCCCC"/>
-              <w:insideH w:val="single" w:sz="1" w:space="0" w:color="CCCCCC"/>
-              <w:insideV w:val="single" w:sz="1" w:space="0" w:color="CCCCCC"/>
             </w:tcBorders>
             <w:shd w:val="clear" w:color="auto" w:fill="F9FAFB"/>
           </w:tcPr>
@@ -3857,11 +3993,17 @@
       </w:r>
     </w:p>
     <w:p>
+      <w:pPr>
+        <w:spacing w:after="120"/>
+      </w:pPr>
       <w:r>
         <w:t>La chiusura cassa archivia la sessione corrente: tutti gli scontrini vengono collegati alla sessione e il contatore ricomincia da #0001. È una funzione riservata agli amministratori.</w:t>
       </w:r>
     </w:p>
     <w:p>
+      <w:pPr>
+        <w:spacing w:after="40"/>
+      </w:pPr>
       <w:r>
         <w:rPr>
           <w:b/>
@@ -3876,6 +4018,7 @@
           <w:ilvl w:val="0"/>
           <w:numId w:val="3"/>
         </w:numPr>
+        <w:spacing w:before="40" w:after="40"/>
       </w:pPr>
       <w:r>
         <w:t xml:space="preserve">In Statistiche, premi il pulsante </w:t>
@@ -3897,6 +4040,7 @@
           <w:ilvl w:val="0"/>
           <w:numId w:val="3"/>
         </w:numPr>
+        <w:spacing w:before="40" w:after="40"/>
       </w:pPr>
       <w:r>
         <w:t>Verifica il riepilogo nell'anteprima: scontrini validi, incasso reale, buoni, contanti, carta, Satispay</w:t>
@@ -3909,6 +4053,7 @@
           <w:ilvl w:val="0"/>
           <w:numId w:val="3"/>
         </w:numPr>
+        <w:spacing w:before="40" w:after="40"/>
       </w:pPr>
       <w:r>
         <w:t>Assegna un nome alla sessione (opzionale, default: data corrente)</w:t>
@@ -3921,6 +4066,7 @@
           <w:ilvl w:val="0"/>
           <w:numId w:val="3"/>
         </w:numPr>
+        <w:spacing w:before="40" w:after="40"/>
       </w:pPr>
       <w:r>
         <w:t>Conferma — il sistema crea la sessione archivio e collega tutti gli scontrini correnti</w:t>
@@ -3933,12 +4079,16 @@
           <w:ilvl w:val="0"/>
           <w:numId w:val="3"/>
         </w:numPr>
+        <w:spacing w:before="40" w:after="40"/>
       </w:pPr>
       <w:r>
         <w:t>Al termine, il contatore scontrini riparte automaticamente da #0001</w:t>
       </w:r>
     </w:p>
     <w:p>
+      <w:pPr>
+        <w:spacing w:after="40"/>
+      </w:pPr>
       <w:r>
         <w:rPr>
           <w:b/>
@@ -3953,6 +4103,7 @@
           <w:ilvl w:val="0"/>
           <w:numId w:val="2"/>
         </w:numPr>
+        <w:spacing w:before="40" w:after="40"/>
       </w:pPr>
       <w:r>
         <w:t xml:space="preserve">File </w:t>
@@ -3974,6 +4125,7 @@
           <w:ilvl w:val="0"/>
           <w:numId w:val="2"/>
         </w:numPr>
+        <w:spacing w:before="40" w:after="40"/>
       </w:pPr>
       <w:r>
         <w:t xml:space="preserve">File </w:t>
@@ -3989,6 +4141,9 @@
       </w:r>
     </w:p>
     <w:p>
+      <w:pPr>
+        <w:spacing w:after="120"/>
+      </w:pPr>
       <w:r>
         <w:t>Se hai configurato i destinatari in Setup → Notifiche, il report viene inviato via email con l'</w:t>
       </w:r>
@@ -4034,6 +4189,9 @@
       </w:r>
     </w:p>
     <w:p>
+      <w:pPr>
+        <w:spacing w:after="120"/>
+      </w:pPr>
       <w:r>
         <w:t>In fondo alla pagina, nella sezione Storico scontrini, trovi i pulsanti:</w:t>
       </w:r>
@@ -4045,6 +4203,7 @@
           <w:ilvl w:val="0"/>
           <w:numId w:val="2"/>
         </w:numPr>
+        <w:spacing w:before="40" w:after="40"/>
       </w:pPr>
       <w:r>
         <w:rPr>
@@ -4063,6 +4222,7 @@
           <w:ilvl w:val="0"/>
           <w:numId w:val="2"/>
         </w:numPr>
+        <w:spacing w:before="40" w:after="40"/>
       </w:pPr>
       <w:r>
         <w:rPr>
@@ -4120,6 +4280,7 @@
           <w:ilvl w:val="0"/>
           <w:numId w:val="3"/>
         </w:numPr>
+        <w:spacing w:before="40" w:after="40"/>
       </w:pPr>
       <w:r>
         <w:t xml:space="preserve">Fai doppio clic su </w:t>
@@ -4138,6 +4299,7 @@
           <w:ilvl w:val="0"/>
           <w:numId w:val="3"/>
         </w:numPr>
+        <w:spacing w:before="40" w:after="40"/>
       </w:pPr>
       <w:r>
         <w:t>Il backup viene salvato nella cartella `backup\` con la data e l'ora nel nome del file</w:t>
@@ -4175,6 +4337,9 @@
       </w:r>
     </w:p>
     <w:p>
+      <w:pPr>
+        <w:spacing w:after="120"/>
+      </w:pPr>
       <w:r>
         <w:t>Tutti i dati sono contenuti nella cartella `app\pb_data\`.</w:t>
       </w:r>
@@ -4211,6 +4376,9 @@
       </w:r>
     </w:p>
     <w:p>
+      <w:pPr>
+        <w:spacing w:after="120"/>
+      </w:pPr>
       <w:r>
         <w:t>Per spostare il database su un nuovo PC o una nuova chiavetta:</w:t>
       </w:r>
@@ -4222,6 +4390,7 @@
           <w:ilvl w:val="0"/>
           <w:numId w:val="3"/>
         </w:numPr>
+        <w:spacing w:before="40" w:after="40"/>
       </w:pPr>
       <w:r>
         <w:t>Copia la cartella `app\pb_data\` dalla vecchia installazione</w:t>
@@ -4234,6 +4403,7 @@
           <w:ilvl w:val="0"/>
           <w:numId w:val="3"/>
         </w:numPr>
+        <w:spacing w:before="40" w:after="40"/>
       </w:pPr>
       <w:r>
         <w:t>Incollala nella stessa posizione nella nuova installazione (sovrascrivi)</w:t>
@@ -4246,6 +4416,7 @@
           <w:ilvl w:val="0"/>
           <w:numId w:val="3"/>
         </w:numPr>
+        <w:spacing w:before="40" w:after="40"/>
       </w:pPr>
       <w:r>
         <w:t>Avvia la nuova installazione — troverà tutti i dati</w:t>
@@ -4269,6 +4440,7 @@
           <w:ilvl w:val="0"/>
           <w:numId w:val="3"/>
         </w:numPr>
+        <w:spacing w:before="40" w:after="40"/>
       </w:pPr>
       <w:r>
         <w:t>Spegni la cassa (chiudi la finestra nera)</w:t>
@@ -4281,6 +4453,7 @@
           <w:ilvl w:val="0"/>
           <w:numId w:val="3"/>
         </w:numPr>
+        <w:spacing w:before="40" w:after="40"/>
       </w:pPr>
       <w:r>
         <w:t>Apri la cartella `backup\` e trova il backup da ripristinare</w:t>
@@ -4293,6 +4466,7 @@
           <w:ilvl w:val="0"/>
           <w:numId w:val="3"/>
         </w:numPr>
+        <w:spacing w:before="40" w:after="40"/>
       </w:pPr>
       <w:r>
         <w:t>Copia il file `.db` e rinominalo `data.db`</w:t>
@@ -4305,6 +4479,7 @@
           <w:ilvl w:val="0"/>
           <w:numId w:val="3"/>
         </w:numPr>
+        <w:spacing w:before="40" w:after="40"/>
       </w:pPr>
       <w:r>
         <w:t>Incollalo in `app\pb_data\` sovrascrivendo il file esistente</w:t>
@@ -4317,6 +4492,7 @@
           <w:ilvl w:val="0"/>
           <w:numId w:val="3"/>
         </w:numPr>
+        <w:spacing w:before="40" w:after="40"/>
       </w:pPr>
       <w:r>
         <w:t>Riavvia la cassa</w:t>
@@ -4360,8 +4536,6 @@
               <w:left w:val="single" w:sz="1" w:space="0" w:color="CCCCCC"/>
               <w:bottom w:val="single" w:sz="1" w:space="0" w:color="CCCCCC"/>
               <w:right w:val="single" w:sz="1" w:space="0" w:color="CCCCCC"/>
-              <w:insideH w:val="single" w:sz="1" w:space="0" w:color="CCCCCC"/>
-              <w:insideV w:val="single" w:sz="1" w:space="0" w:color="CCCCCC"/>
             </w:tcBorders>
             <w:shd w:val="clear" w:color="auto" w:fill="F5F5F5"/>
           </w:tcPr>
@@ -4389,8 +4563,6 @@
               <w:left w:val="single" w:sz="1" w:space="0" w:color="CCCCCC"/>
               <w:bottom w:val="single" w:sz="1" w:space="0" w:color="CCCCCC"/>
               <w:right w:val="single" w:sz="1" w:space="0" w:color="CCCCCC"/>
-              <w:insideH w:val="single" w:sz="1" w:space="0" w:color="CCCCCC"/>
-              <w:insideV w:val="single" w:sz="1" w:space="0" w:color="CCCCCC"/>
             </w:tcBorders>
             <w:shd w:val="clear" w:color="auto" w:fill="F5F5F5"/>
           </w:tcPr>
@@ -4420,8 +4592,6 @@
               <w:left w:val="single" w:sz="1" w:space="0" w:color="CCCCCC"/>
               <w:bottom w:val="single" w:sz="1" w:space="0" w:color="CCCCCC"/>
               <w:right w:val="single" w:sz="1" w:space="0" w:color="CCCCCC"/>
-              <w:insideH w:val="single" w:sz="1" w:space="0" w:color="CCCCCC"/>
-              <w:insideV w:val="single" w:sz="1" w:space="0" w:color="CCCCCC"/>
             </w:tcBorders>
             <w:shd w:val="clear" w:color="auto" w:fill="F9FAFB"/>
           </w:tcPr>
@@ -4440,8 +4610,6 @@
               <w:left w:val="single" w:sz="1" w:space="0" w:color="CCCCCC"/>
               <w:bottom w:val="single" w:sz="1" w:space="0" w:color="CCCCCC"/>
               <w:right w:val="single" w:sz="1" w:space="0" w:color="CCCCCC"/>
-              <w:insideH w:val="single" w:sz="1" w:space="0" w:color="CCCCCC"/>
-              <w:insideV w:val="single" w:sz="1" w:space="0" w:color="CCCCCC"/>
             </w:tcBorders>
             <w:shd w:val="clear" w:color="auto" w:fill="F9FAFB"/>
           </w:tcPr>
@@ -4468,8 +4636,6 @@
               <w:left w:val="single" w:sz="1" w:space="0" w:color="CCCCCC"/>
               <w:bottom w:val="single" w:sz="1" w:space="0" w:color="CCCCCC"/>
               <w:right w:val="single" w:sz="1" w:space="0" w:color="CCCCCC"/>
-              <w:insideH w:val="single" w:sz="1" w:space="0" w:color="CCCCCC"/>
-              <w:insideV w:val="single" w:sz="1" w:space="0" w:color="CCCCCC"/>
             </w:tcBorders>
           </w:tcPr>
           <w:p>
@@ -4487,8 +4653,6 @@
               <w:left w:val="single" w:sz="1" w:space="0" w:color="CCCCCC"/>
               <w:bottom w:val="single" w:sz="1" w:space="0" w:color="CCCCCC"/>
               <w:right w:val="single" w:sz="1" w:space="0" w:color="CCCCCC"/>
-              <w:insideH w:val="single" w:sz="1" w:space="0" w:color="CCCCCC"/>
-              <w:insideV w:val="single" w:sz="1" w:space="0" w:color="CCCCCC"/>
             </w:tcBorders>
           </w:tcPr>
           <w:p>
@@ -4508,8 +4672,6 @@
               <w:left w:val="single" w:sz="1" w:space="0" w:color="CCCCCC"/>
               <w:bottom w:val="single" w:sz="1" w:space="0" w:color="CCCCCC"/>
               <w:right w:val="single" w:sz="1" w:space="0" w:color="CCCCCC"/>
-              <w:insideH w:val="single" w:sz="1" w:space="0" w:color="CCCCCC"/>
-              <w:insideV w:val="single" w:sz="1" w:space="0" w:color="CCCCCC"/>
             </w:tcBorders>
             <w:shd w:val="clear" w:color="auto" w:fill="F9FAFB"/>
           </w:tcPr>
@@ -4528,8 +4690,6 @@
               <w:left w:val="single" w:sz="1" w:space="0" w:color="CCCCCC"/>
               <w:bottom w:val="single" w:sz="1" w:space="0" w:color="CCCCCC"/>
               <w:right w:val="single" w:sz="1" w:space="0" w:color="CCCCCC"/>
-              <w:insideH w:val="single" w:sz="1" w:space="0" w:color="CCCCCC"/>
-              <w:insideV w:val="single" w:sz="1" w:space="0" w:color="CCCCCC"/>
             </w:tcBorders>
             <w:shd w:val="clear" w:color="auto" w:fill="F9FAFB"/>
           </w:tcPr>
@@ -4550,8 +4710,6 @@
               <w:left w:val="single" w:sz="1" w:space="0" w:color="CCCCCC"/>
               <w:bottom w:val="single" w:sz="1" w:space="0" w:color="CCCCCC"/>
               <w:right w:val="single" w:sz="1" w:space="0" w:color="CCCCCC"/>
-              <w:insideH w:val="single" w:sz="1" w:space="0" w:color="CCCCCC"/>
-              <w:insideV w:val="single" w:sz="1" w:space="0" w:color="CCCCCC"/>
             </w:tcBorders>
           </w:tcPr>
           <w:p>
@@ -4569,8 +4727,6 @@
               <w:left w:val="single" w:sz="1" w:space="0" w:color="CCCCCC"/>
               <w:bottom w:val="single" w:sz="1" w:space="0" w:color="CCCCCC"/>
               <w:right w:val="single" w:sz="1" w:space="0" w:color="CCCCCC"/>
-              <w:insideH w:val="single" w:sz="1" w:space="0" w:color="CCCCCC"/>
-              <w:insideV w:val="single" w:sz="1" w:space="0" w:color="CCCCCC"/>
             </w:tcBorders>
           </w:tcPr>
           <w:p>
@@ -4612,8 +4768,6 @@
               <w:left w:val="single" w:sz="1" w:space="0" w:color="CCCCCC"/>
               <w:bottom w:val="single" w:sz="1" w:space="0" w:color="CCCCCC"/>
               <w:right w:val="single" w:sz="1" w:space="0" w:color="CCCCCC"/>
-              <w:insideH w:val="single" w:sz="1" w:space="0" w:color="CCCCCC"/>
-              <w:insideV w:val="single" w:sz="1" w:space="0" w:color="CCCCCC"/>
             </w:tcBorders>
             <w:shd w:val="clear" w:color="auto" w:fill="F5F5F5"/>
           </w:tcPr>
@@ -4641,8 +4795,6 @@
               <w:left w:val="single" w:sz="1" w:space="0" w:color="CCCCCC"/>
               <w:bottom w:val="single" w:sz="1" w:space="0" w:color="CCCCCC"/>
               <w:right w:val="single" w:sz="1" w:space="0" w:color="CCCCCC"/>
-              <w:insideH w:val="single" w:sz="1" w:space="0" w:color="CCCCCC"/>
-              <w:insideV w:val="single" w:sz="1" w:space="0" w:color="CCCCCC"/>
             </w:tcBorders>
             <w:shd w:val="clear" w:color="auto" w:fill="F5F5F5"/>
           </w:tcPr>
@@ -4672,8 +4824,6 @@
               <w:left w:val="single" w:sz="1" w:space="0" w:color="CCCCCC"/>
               <w:bottom w:val="single" w:sz="1" w:space="0" w:color="CCCCCC"/>
               <w:right w:val="single" w:sz="1" w:space="0" w:color="CCCCCC"/>
-              <w:insideH w:val="single" w:sz="1" w:space="0" w:color="CCCCCC"/>
-              <w:insideV w:val="single" w:sz="1" w:space="0" w:color="CCCCCC"/>
             </w:tcBorders>
             <w:shd w:val="clear" w:color="auto" w:fill="F9FAFB"/>
           </w:tcPr>
@@ -4692,8 +4842,6 @@
               <w:left w:val="single" w:sz="1" w:space="0" w:color="CCCCCC"/>
               <w:bottom w:val="single" w:sz="1" w:space="0" w:color="CCCCCC"/>
               <w:right w:val="single" w:sz="1" w:space="0" w:color="CCCCCC"/>
-              <w:insideH w:val="single" w:sz="1" w:space="0" w:color="CCCCCC"/>
-              <w:insideV w:val="single" w:sz="1" w:space="0" w:color="CCCCCC"/>
             </w:tcBorders>
             <w:shd w:val="clear" w:color="auto" w:fill="F9FAFB"/>
           </w:tcPr>
@@ -4714,8 +4862,6 @@
               <w:left w:val="single" w:sz="1" w:space="0" w:color="CCCCCC"/>
               <w:bottom w:val="single" w:sz="1" w:space="0" w:color="CCCCCC"/>
               <w:right w:val="single" w:sz="1" w:space="0" w:color="CCCCCC"/>
-              <w:insideH w:val="single" w:sz="1" w:space="0" w:color="CCCCCC"/>
-              <w:insideV w:val="single" w:sz="1" w:space="0" w:color="CCCCCC"/>
             </w:tcBorders>
           </w:tcPr>
           <w:p>
@@ -4733,8 +4879,6 @@
               <w:left w:val="single" w:sz="1" w:space="0" w:color="CCCCCC"/>
               <w:bottom w:val="single" w:sz="1" w:space="0" w:color="CCCCCC"/>
               <w:right w:val="single" w:sz="1" w:space="0" w:color="CCCCCC"/>
-              <w:insideH w:val="single" w:sz="1" w:space="0" w:color="CCCCCC"/>
-              <w:insideV w:val="single" w:sz="1" w:space="0" w:color="CCCCCC"/>
             </w:tcBorders>
           </w:tcPr>
           <w:p>
@@ -4754,8 +4898,6 @@
               <w:left w:val="single" w:sz="1" w:space="0" w:color="CCCCCC"/>
               <w:bottom w:val="single" w:sz="1" w:space="0" w:color="CCCCCC"/>
               <w:right w:val="single" w:sz="1" w:space="0" w:color="CCCCCC"/>
-              <w:insideH w:val="single" w:sz="1" w:space="0" w:color="CCCCCC"/>
-              <w:insideV w:val="single" w:sz="1" w:space="0" w:color="CCCCCC"/>
             </w:tcBorders>
             <w:shd w:val="clear" w:color="auto" w:fill="F9FAFB"/>
           </w:tcPr>
@@ -4774,8 +4916,6 @@
               <w:left w:val="single" w:sz="1" w:space="0" w:color="CCCCCC"/>
               <w:bottom w:val="single" w:sz="1" w:space="0" w:color="CCCCCC"/>
               <w:right w:val="single" w:sz="1" w:space="0" w:color="CCCCCC"/>
-              <w:insideH w:val="single" w:sz="1" w:space="0" w:color="CCCCCC"/>
-              <w:insideV w:val="single" w:sz="1" w:space="0" w:color="CCCCCC"/>
             </w:tcBorders>
             <w:shd w:val="clear" w:color="auto" w:fill="F9FAFB"/>
           </w:tcPr>
@@ -4796,8 +4936,6 @@
               <w:left w:val="single" w:sz="1" w:space="0" w:color="CCCCCC"/>
               <w:bottom w:val="single" w:sz="1" w:space="0" w:color="CCCCCC"/>
               <w:right w:val="single" w:sz="1" w:space="0" w:color="CCCCCC"/>
-              <w:insideH w:val="single" w:sz="1" w:space="0" w:color="CCCCCC"/>
-              <w:insideV w:val="single" w:sz="1" w:space="0" w:color="CCCCCC"/>
             </w:tcBorders>
           </w:tcPr>
           <w:p>
@@ -4815,8 +4953,6 @@
               <w:left w:val="single" w:sz="1" w:space="0" w:color="CCCCCC"/>
               <w:bottom w:val="single" w:sz="1" w:space="0" w:color="CCCCCC"/>
               <w:right w:val="single" w:sz="1" w:space="0" w:color="CCCCCC"/>
-              <w:insideH w:val="single" w:sz="1" w:space="0" w:color="CCCCCC"/>
-              <w:insideV w:val="single" w:sz="1" w:space="0" w:color="CCCCCC"/>
             </w:tcBorders>
           </w:tcPr>
           <w:p>
@@ -4858,8 +4994,6 @@
               <w:left w:val="single" w:sz="1" w:space="0" w:color="CCCCCC"/>
               <w:bottom w:val="single" w:sz="1" w:space="0" w:color="CCCCCC"/>
               <w:right w:val="single" w:sz="1" w:space="0" w:color="CCCCCC"/>
-              <w:insideH w:val="single" w:sz="1" w:space="0" w:color="CCCCCC"/>
-              <w:insideV w:val="single" w:sz="1" w:space="0" w:color="CCCCCC"/>
             </w:tcBorders>
             <w:shd w:val="clear" w:color="auto" w:fill="F5F5F5"/>
           </w:tcPr>
@@ -4887,8 +5021,6 @@
               <w:left w:val="single" w:sz="1" w:space="0" w:color="CCCCCC"/>
               <w:bottom w:val="single" w:sz="1" w:space="0" w:color="CCCCCC"/>
               <w:right w:val="single" w:sz="1" w:space="0" w:color="CCCCCC"/>
-              <w:insideH w:val="single" w:sz="1" w:space="0" w:color="CCCCCC"/>
-              <w:insideV w:val="single" w:sz="1" w:space="0" w:color="CCCCCC"/>
             </w:tcBorders>
             <w:shd w:val="clear" w:color="auto" w:fill="F5F5F5"/>
           </w:tcPr>
@@ -4918,8 +5050,6 @@
               <w:left w:val="single" w:sz="1" w:space="0" w:color="CCCCCC"/>
               <w:bottom w:val="single" w:sz="1" w:space="0" w:color="CCCCCC"/>
               <w:right w:val="single" w:sz="1" w:space="0" w:color="CCCCCC"/>
-              <w:insideH w:val="single" w:sz="1" w:space="0" w:color="CCCCCC"/>
-              <w:insideV w:val="single" w:sz="1" w:space="0" w:color="CCCCCC"/>
             </w:tcBorders>
             <w:shd w:val="clear" w:color="auto" w:fill="F9FAFB"/>
           </w:tcPr>
@@ -4938,8 +5068,6 @@
               <w:left w:val="single" w:sz="1" w:space="0" w:color="CCCCCC"/>
               <w:bottom w:val="single" w:sz="1" w:space="0" w:color="CCCCCC"/>
               <w:right w:val="single" w:sz="1" w:space="0" w:color="CCCCCC"/>
-              <w:insideH w:val="single" w:sz="1" w:space="0" w:color="CCCCCC"/>
-              <w:insideV w:val="single" w:sz="1" w:space="0" w:color="CCCCCC"/>
             </w:tcBorders>
             <w:shd w:val="clear" w:color="auto" w:fill="F9FAFB"/>
           </w:tcPr>
@@ -4960,8 +5088,6 @@
               <w:left w:val="single" w:sz="1" w:space="0" w:color="CCCCCC"/>
               <w:bottom w:val="single" w:sz="1" w:space="0" w:color="CCCCCC"/>
               <w:right w:val="single" w:sz="1" w:space="0" w:color="CCCCCC"/>
-              <w:insideH w:val="single" w:sz="1" w:space="0" w:color="CCCCCC"/>
-              <w:insideV w:val="single" w:sz="1" w:space="0" w:color="CCCCCC"/>
             </w:tcBorders>
           </w:tcPr>
           <w:p>
@@ -4979,8 +5105,6 @@
               <w:left w:val="single" w:sz="1" w:space="0" w:color="CCCCCC"/>
               <w:bottom w:val="single" w:sz="1" w:space="0" w:color="CCCCCC"/>
               <w:right w:val="single" w:sz="1" w:space="0" w:color="CCCCCC"/>
-              <w:insideH w:val="single" w:sz="1" w:space="0" w:color="CCCCCC"/>
-              <w:insideV w:val="single" w:sz="1" w:space="0" w:color="CCCCCC"/>
             </w:tcBorders>
           </w:tcPr>
           <w:p>
@@ -5000,8 +5124,6 @@
               <w:left w:val="single" w:sz="1" w:space="0" w:color="CCCCCC"/>
               <w:bottom w:val="single" w:sz="1" w:space="0" w:color="CCCCCC"/>
               <w:right w:val="single" w:sz="1" w:space="0" w:color="CCCCCC"/>
-              <w:insideH w:val="single" w:sz="1" w:space="0" w:color="CCCCCC"/>
-              <w:insideV w:val="single" w:sz="1" w:space="0" w:color="CCCCCC"/>
             </w:tcBorders>
             <w:shd w:val="clear" w:color="auto" w:fill="F9FAFB"/>
           </w:tcPr>
@@ -5020,8 +5142,6 @@
               <w:left w:val="single" w:sz="1" w:space="0" w:color="CCCCCC"/>
               <w:bottom w:val="single" w:sz="1" w:space="0" w:color="CCCCCC"/>
               <w:right w:val="single" w:sz="1" w:space="0" w:color="CCCCCC"/>
-              <w:insideH w:val="single" w:sz="1" w:space="0" w:color="CCCCCC"/>
-              <w:insideV w:val="single" w:sz="1" w:space="0" w:color="CCCCCC"/>
             </w:tcBorders>
             <w:shd w:val="clear" w:color="auto" w:fill="F9FAFB"/>
           </w:tcPr>
@@ -5042,8 +5162,6 @@
               <w:left w:val="single" w:sz="1" w:space="0" w:color="CCCCCC"/>
               <w:bottom w:val="single" w:sz="1" w:space="0" w:color="CCCCCC"/>
               <w:right w:val="single" w:sz="1" w:space="0" w:color="CCCCCC"/>
-              <w:insideH w:val="single" w:sz="1" w:space="0" w:color="CCCCCC"/>
-              <w:insideV w:val="single" w:sz="1" w:space="0" w:color="CCCCCC"/>
             </w:tcBorders>
           </w:tcPr>
           <w:p>
@@ -5061,8 +5179,6 @@
               <w:left w:val="single" w:sz="1" w:space="0" w:color="CCCCCC"/>
               <w:bottom w:val="single" w:sz="1" w:space="0" w:color="CCCCCC"/>
               <w:right w:val="single" w:sz="1" w:space="0" w:color="CCCCCC"/>
-              <w:insideH w:val="single" w:sz="1" w:space="0" w:color="CCCCCC"/>
-              <w:insideV w:val="single" w:sz="1" w:space="0" w:color="CCCCCC"/>
             </w:tcBorders>
           </w:tcPr>
           <w:p>
@@ -5101,8 +5217,6 @@
               <w:left w:val="single" w:sz="1" w:space="0" w:color="1A5276"/>
               <w:bottom w:val="single" w:sz="1" w:space="0" w:color="1A5276"/>
               <w:right w:val="single" w:sz="1" w:space="0" w:color="1A5276"/>
-              <w:insideH w:val="single" w:sz="1" w:space="0" w:color="1A5276"/>
-              <w:insideV w:val="single" w:sz="1" w:space="0" w:color="1A5276"/>
             </w:tcBorders>
             <w:shd w:val="clear" w:color="auto" w:fill="1A5276"/>
           </w:tcPr>
@@ -5130,8 +5244,6 @@
               <w:left w:val="single" w:sz="1" w:space="0" w:color="1A5276"/>
               <w:bottom w:val="single" w:sz="1" w:space="0" w:color="1A5276"/>
               <w:right w:val="single" w:sz="1" w:space="0" w:color="1A5276"/>
-              <w:insideH w:val="single" w:sz="1" w:space="0" w:color="1A5276"/>
-              <w:insideV w:val="single" w:sz="1" w:space="0" w:color="1A5276"/>
             </w:tcBorders>
             <w:shd w:val="clear" w:color="auto" w:fill="1A5276"/>
           </w:tcPr>
@@ -5161,8 +5273,6 @@
               <w:left w:val="single" w:sz="1" w:space="0" w:color="1A5276"/>
               <w:bottom w:val="single" w:sz="1" w:space="0" w:color="1A5276"/>
               <w:right w:val="single" w:sz="1" w:space="0" w:color="1A5276"/>
-              <w:insideH w:val="single" w:sz="1" w:space="0" w:color="1A5276"/>
-              <w:insideV w:val="single" w:sz="1" w:space="0" w:color="1A5276"/>
             </w:tcBorders>
             <w:shd w:val="clear" w:color="auto" w:fill="F9FAFB"/>
           </w:tcPr>
@@ -5181,8 +5291,6 @@
               <w:left w:val="single" w:sz="1" w:space="0" w:color="1A5276"/>
               <w:bottom w:val="single" w:sz="1" w:space="0" w:color="1A5276"/>
               <w:right w:val="single" w:sz="1" w:space="0" w:color="1A5276"/>
-              <w:insideH w:val="single" w:sz="1" w:space="0" w:color="1A5276"/>
-              <w:insideV w:val="single" w:sz="1" w:space="0" w:color="1A5276"/>
             </w:tcBorders>
             <w:shd w:val="clear" w:color="auto" w:fill="F9FAFB"/>
           </w:tcPr>
@@ -5203,8 +5311,6 @@
               <w:left w:val="single" w:sz="1" w:space="0" w:color="1A5276"/>
               <w:bottom w:val="single" w:sz="1" w:space="0" w:color="1A5276"/>
               <w:right w:val="single" w:sz="1" w:space="0" w:color="1A5276"/>
-              <w:insideH w:val="single" w:sz="1" w:space="0" w:color="1A5276"/>
-              <w:insideV w:val="single" w:sz="1" w:space="0" w:color="1A5276"/>
             </w:tcBorders>
           </w:tcPr>
           <w:p>
@@ -5222,8 +5328,6 @@
               <w:left w:val="single" w:sz="1" w:space="0" w:color="1A5276"/>
               <w:bottom w:val="single" w:sz="1" w:space="0" w:color="1A5276"/>
               <w:right w:val="single" w:sz="1" w:space="0" w:color="1A5276"/>
-              <w:insideH w:val="single" w:sz="1" w:space="0" w:color="1A5276"/>
-              <w:insideV w:val="single" w:sz="1" w:space="0" w:color="1A5276"/>
             </w:tcBorders>
           </w:tcPr>
           <w:p>
@@ -5243,8 +5347,6 @@
               <w:left w:val="single" w:sz="1" w:space="0" w:color="1A5276"/>
               <w:bottom w:val="single" w:sz="1" w:space="0" w:color="1A5276"/>
               <w:right w:val="single" w:sz="1" w:space="0" w:color="1A5276"/>
-              <w:insideH w:val="single" w:sz="1" w:space="0" w:color="1A5276"/>
-              <w:insideV w:val="single" w:sz="1" w:space="0" w:color="1A5276"/>
             </w:tcBorders>
             <w:shd w:val="clear" w:color="auto" w:fill="F9FAFB"/>
           </w:tcPr>
@@ -5263,8 +5365,6 @@
               <w:left w:val="single" w:sz="1" w:space="0" w:color="1A5276"/>
               <w:bottom w:val="single" w:sz="1" w:space="0" w:color="1A5276"/>
               <w:right w:val="single" w:sz="1" w:space="0" w:color="1A5276"/>
-              <w:insideH w:val="single" w:sz="1" w:space="0" w:color="1A5276"/>
-              <w:insideV w:val="single" w:sz="1" w:space="0" w:color="1A5276"/>
             </w:tcBorders>
             <w:shd w:val="clear" w:color="auto" w:fill="F9FAFB"/>
           </w:tcPr>
@@ -5285,8 +5385,6 @@
               <w:left w:val="single" w:sz="1" w:space="0" w:color="1A5276"/>
               <w:bottom w:val="single" w:sz="1" w:space="0" w:color="1A5276"/>
               <w:right w:val="single" w:sz="1" w:space="0" w:color="1A5276"/>
-              <w:insideH w:val="single" w:sz="1" w:space="0" w:color="1A5276"/>
-              <w:insideV w:val="single" w:sz="1" w:space="0" w:color="1A5276"/>
             </w:tcBorders>
           </w:tcPr>
           <w:p>
@@ -5304,8 +5402,6 @@
               <w:left w:val="single" w:sz="1" w:space="0" w:color="1A5276"/>
               <w:bottom w:val="single" w:sz="1" w:space="0" w:color="1A5276"/>
               <w:right w:val="single" w:sz="1" w:space="0" w:color="1A5276"/>
-              <w:insideH w:val="single" w:sz="1" w:space="0" w:color="1A5276"/>
-              <w:insideV w:val="single" w:sz="1" w:space="0" w:color="1A5276"/>
             </w:tcBorders>
           </w:tcPr>
           <w:p>
@@ -5325,8 +5421,6 @@
               <w:left w:val="single" w:sz="1" w:space="0" w:color="1A5276"/>
               <w:bottom w:val="single" w:sz="1" w:space="0" w:color="1A5276"/>
               <w:right w:val="single" w:sz="1" w:space="0" w:color="1A5276"/>
-              <w:insideH w:val="single" w:sz="1" w:space="0" w:color="1A5276"/>
-              <w:insideV w:val="single" w:sz="1" w:space="0" w:color="1A5276"/>
             </w:tcBorders>
             <w:shd w:val="clear" w:color="auto" w:fill="F9FAFB"/>
           </w:tcPr>
@@ -5345,8 +5439,6 @@
               <w:left w:val="single" w:sz="1" w:space="0" w:color="1A5276"/>
               <w:bottom w:val="single" w:sz="1" w:space="0" w:color="1A5276"/>
               <w:right w:val="single" w:sz="1" w:space="0" w:color="1A5276"/>
-              <w:insideH w:val="single" w:sz="1" w:space="0" w:color="1A5276"/>
-              <w:insideV w:val="single" w:sz="1" w:space="0" w:color="1A5276"/>
             </w:tcBorders>
             <w:shd w:val="clear" w:color="auto" w:fill="F9FAFB"/>
           </w:tcPr>
@@ -5367,8 +5459,6 @@
               <w:left w:val="single" w:sz="1" w:space="0" w:color="1A5276"/>
               <w:bottom w:val="single" w:sz="1" w:space="0" w:color="1A5276"/>
               <w:right w:val="single" w:sz="1" w:space="0" w:color="1A5276"/>
-              <w:insideH w:val="single" w:sz="1" w:space="0" w:color="1A5276"/>
-              <w:insideV w:val="single" w:sz="1" w:space="0" w:color="1A5276"/>
             </w:tcBorders>
           </w:tcPr>
           <w:p>
@@ -5386,8 +5476,6 @@
               <w:left w:val="single" w:sz="1" w:space="0" w:color="1A5276"/>
               <w:bottom w:val="single" w:sz="1" w:space="0" w:color="1A5276"/>
               <w:right w:val="single" w:sz="1" w:space="0" w:color="1A5276"/>
-              <w:insideH w:val="single" w:sz="1" w:space="0" w:color="1A5276"/>
-              <w:insideV w:val="single" w:sz="1" w:space="0" w:color="1A5276"/>
             </w:tcBorders>
           </w:tcPr>
           <w:p>
@@ -5407,8 +5495,6 @@
               <w:left w:val="single" w:sz="1" w:space="0" w:color="1A5276"/>
               <w:bottom w:val="single" w:sz="1" w:space="0" w:color="1A5276"/>
               <w:right w:val="single" w:sz="1" w:space="0" w:color="1A5276"/>
-              <w:insideH w:val="single" w:sz="1" w:space="0" w:color="1A5276"/>
-              <w:insideV w:val="single" w:sz="1" w:space="0" w:color="1A5276"/>
             </w:tcBorders>
             <w:shd w:val="clear" w:color="auto" w:fill="F9FAFB"/>
           </w:tcPr>
@@ -5427,8 +5513,6 @@
               <w:left w:val="single" w:sz="1" w:space="0" w:color="1A5276"/>
               <w:bottom w:val="single" w:sz="1" w:space="0" w:color="1A5276"/>
               <w:right w:val="single" w:sz="1" w:space="0" w:color="1A5276"/>
-              <w:insideH w:val="single" w:sz="1" w:space="0" w:color="1A5276"/>
-              <w:insideV w:val="single" w:sz="1" w:space="0" w:color="1A5276"/>
             </w:tcBorders>
             <w:shd w:val="clear" w:color="auto" w:fill="F9FAFB"/>
           </w:tcPr>
@@ -5449,8 +5533,6 @@
               <w:left w:val="single" w:sz="1" w:space="0" w:color="1A5276"/>
               <w:bottom w:val="single" w:sz="1" w:space="0" w:color="1A5276"/>
               <w:right w:val="single" w:sz="1" w:space="0" w:color="1A5276"/>
-              <w:insideH w:val="single" w:sz="1" w:space="0" w:color="1A5276"/>
-              <w:insideV w:val="single" w:sz="1" w:space="0" w:color="1A5276"/>
             </w:tcBorders>
           </w:tcPr>
           <w:p>
@@ -5468,8 +5550,6 @@
               <w:left w:val="single" w:sz="1" w:space="0" w:color="1A5276"/>
               <w:bottom w:val="single" w:sz="1" w:space="0" w:color="1A5276"/>
               <w:right w:val="single" w:sz="1" w:space="0" w:color="1A5276"/>
-              <w:insideH w:val="single" w:sz="1" w:space="0" w:color="1A5276"/>
-              <w:insideV w:val="single" w:sz="1" w:space="0" w:color="1A5276"/>
             </w:tcBorders>
           </w:tcPr>
           <w:p>
@@ -5489,8 +5569,6 @@
               <w:left w:val="single" w:sz="1" w:space="0" w:color="1A5276"/>
               <w:bottom w:val="single" w:sz="1" w:space="0" w:color="1A5276"/>
               <w:right w:val="single" w:sz="1" w:space="0" w:color="1A5276"/>
-              <w:insideH w:val="single" w:sz="1" w:space="0" w:color="1A5276"/>
-              <w:insideV w:val="single" w:sz="1" w:space="0" w:color="1A5276"/>
             </w:tcBorders>
             <w:shd w:val="clear" w:color="auto" w:fill="F9FAFB"/>
           </w:tcPr>
@@ -5509,8 +5587,6 @@
               <w:left w:val="single" w:sz="1" w:space="0" w:color="1A5276"/>
               <w:bottom w:val="single" w:sz="1" w:space="0" w:color="1A5276"/>
               <w:right w:val="single" w:sz="1" w:space="0" w:color="1A5276"/>
-              <w:insideH w:val="single" w:sz="1" w:space="0" w:color="1A5276"/>
-              <w:insideV w:val="single" w:sz="1" w:space="0" w:color="1A5276"/>
             </w:tcBorders>
             <w:shd w:val="clear" w:color="auto" w:fill="F9FAFB"/>
           </w:tcPr>
@@ -5534,8 +5610,6 @@
               <w:left w:val="single" w:sz="1" w:space="0" w:color="1A5276"/>
               <w:bottom w:val="single" w:sz="1" w:space="0" w:color="1A5276"/>
               <w:right w:val="single" w:sz="1" w:space="0" w:color="1A5276"/>
-              <w:insideH w:val="single" w:sz="1" w:space="0" w:color="1A5276"/>
-              <w:insideV w:val="single" w:sz="1" w:space="0" w:color="1A5276"/>
             </w:tcBorders>
           </w:tcPr>
           <w:p>
@@ -5553,8 +5627,6 @@
               <w:left w:val="single" w:sz="1" w:space="0" w:color="1A5276"/>
               <w:bottom w:val="single" w:sz="1" w:space="0" w:color="1A5276"/>
               <w:right w:val="single" w:sz="1" w:space="0" w:color="1A5276"/>
-              <w:insideH w:val="single" w:sz="1" w:space="0" w:color="1A5276"/>
-              <w:insideV w:val="single" w:sz="1" w:space="0" w:color="1A5276"/>
             </w:tcBorders>
           </w:tcPr>
           <w:p>
@@ -5574,8 +5646,6 @@
               <w:left w:val="single" w:sz="1" w:space="0" w:color="1A5276"/>
               <w:bottom w:val="single" w:sz="1" w:space="0" w:color="1A5276"/>
               <w:right w:val="single" w:sz="1" w:space="0" w:color="1A5276"/>
-              <w:insideH w:val="single" w:sz="1" w:space="0" w:color="1A5276"/>
-              <w:insideV w:val="single" w:sz="1" w:space="0" w:color="1A5276"/>
             </w:tcBorders>
             <w:shd w:val="clear" w:color="auto" w:fill="F9FAFB"/>
           </w:tcPr>
@@ -5594,8 +5664,6 @@
               <w:left w:val="single" w:sz="1" w:space="0" w:color="1A5276"/>
               <w:bottom w:val="single" w:sz="1" w:space="0" w:color="1A5276"/>
               <w:right w:val="single" w:sz="1" w:space="0" w:color="1A5276"/>
-              <w:insideH w:val="single" w:sz="1" w:space="0" w:color="1A5276"/>
-              <w:insideV w:val="single" w:sz="1" w:space="0" w:color="1A5276"/>
             </w:tcBorders>
             <w:shd w:val="clear" w:color="auto" w:fill="F9FAFB"/>
           </w:tcPr>
@@ -5616,8 +5684,6 @@
               <w:left w:val="single" w:sz="1" w:space="0" w:color="1A5276"/>
               <w:bottom w:val="single" w:sz="1" w:space="0" w:color="1A5276"/>
               <w:right w:val="single" w:sz="1" w:space="0" w:color="1A5276"/>
-              <w:insideH w:val="single" w:sz="1" w:space="0" w:color="1A5276"/>
-              <w:insideV w:val="single" w:sz="1" w:space="0" w:color="1A5276"/>
             </w:tcBorders>
           </w:tcPr>
           <w:p>
@@ -5635,8 +5701,6 @@
               <w:left w:val="single" w:sz="1" w:space="0" w:color="1A5276"/>
               <w:bottom w:val="single" w:sz="1" w:space="0" w:color="1A5276"/>
               <w:right w:val="single" w:sz="1" w:space="0" w:color="1A5276"/>
-              <w:insideH w:val="single" w:sz="1" w:space="0" w:color="1A5276"/>
-              <w:insideV w:val="single" w:sz="1" w:space="0" w:color="1A5276"/>
             </w:tcBorders>
           </w:tcPr>
           <w:p>
@@ -5656,8 +5720,6 @@
               <w:left w:val="single" w:sz="1" w:space="0" w:color="1A5276"/>
               <w:bottom w:val="single" w:sz="1" w:space="0" w:color="1A5276"/>
               <w:right w:val="single" w:sz="1" w:space="0" w:color="1A5276"/>
-              <w:insideH w:val="single" w:sz="1" w:space="0" w:color="1A5276"/>
-              <w:insideV w:val="single" w:sz="1" w:space="0" w:color="1A5276"/>
             </w:tcBorders>
             <w:shd w:val="clear" w:color="auto" w:fill="F9FAFB"/>
           </w:tcPr>
@@ -5676,8 +5738,6 @@
               <w:left w:val="single" w:sz="1" w:space="0" w:color="1A5276"/>
               <w:bottom w:val="single" w:sz="1" w:space="0" w:color="1A5276"/>
               <w:right w:val="single" w:sz="1" w:space="0" w:color="1A5276"/>
-              <w:insideH w:val="single" w:sz="1" w:space="0" w:color="1A5276"/>
-              <w:insideV w:val="single" w:sz="1" w:space="0" w:color="1A5276"/>
             </w:tcBorders>
             <w:shd w:val="clear" w:color="auto" w:fill="F9FAFB"/>
           </w:tcPr>
@@ -5698,8 +5758,6 @@
               <w:left w:val="single" w:sz="1" w:space="0" w:color="1A5276"/>
               <w:bottom w:val="single" w:sz="1" w:space="0" w:color="1A5276"/>
               <w:right w:val="single" w:sz="1" w:space="0" w:color="1A5276"/>
-              <w:insideH w:val="single" w:sz="1" w:space="0" w:color="1A5276"/>
-              <w:insideV w:val="single" w:sz="1" w:space="0" w:color="1A5276"/>
             </w:tcBorders>
           </w:tcPr>
           <w:p>
@@ -5717,8 +5775,6 @@
               <w:left w:val="single" w:sz="1" w:space="0" w:color="1A5276"/>
               <w:bottom w:val="single" w:sz="1" w:space="0" w:color="1A5276"/>
               <w:right w:val="single" w:sz="1" w:space="0" w:color="1A5276"/>
-              <w:insideH w:val="single" w:sz="1" w:space="0" w:color="1A5276"/>
-              <w:insideV w:val="single" w:sz="1" w:space="0" w:color="1A5276"/>
             </w:tcBorders>
           </w:tcPr>
           <w:p>
@@ -5738,8 +5794,6 @@
               <w:left w:val="single" w:sz="1" w:space="0" w:color="1A5276"/>
               <w:bottom w:val="single" w:sz="1" w:space="0" w:color="1A5276"/>
               <w:right w:val="single" w:sz="1" w:space="0" w:color="1A5276"/>
-              <w:insideH w:val="single" w:sz="1" w:space="0" w:color="1A5276"/>
-              <w:insideV w:val="single" w:sz="1" w:space="0" w:color="1A5276"/>
             </w:tcBorders>
             <w:shd w:val="clear" w:color="auto" w:fill="F9FAFB"/>
           </w:tcPr>
@@ -5758,8 +5812,6 @@
               <w:left w:val="single" w:sz="1" w:space="0" w:color="1A5276"/>
               <w:bottom w:val="single" w:sz="1" w:space="0" w:color="1A5276"/>
               <w:right w:val="single" w:sz="1" w:space="0" w:color="1A5276"/>
-              <w:insideH w:val="single" w:sz="1" w:space="0" w:color="1A5276"/>
-              <w:insideV w:val="single" w:sz="1" w:space="0" w:color="1A5276"/>
             </w:tcBorders>
             <w:shd w:val="clear" w:color="auto" w:fill="F9FAFB"/>
           </w:tcPr>
@@ -5781,6 +5833,9 @@
       </w:r>
     </w:p>
     <w:p>
+      <w:pPr>
+        <w:spacing w:after="120"/>
+      </w:pPr>
       <w:r>
         <w:t>PocketBase include un pannello di amministrazione avanzato accessibile dal browser.</w:t>
       </w:r>
@@ -5792,6 +5847,7 @@
           <w:ilvl w:val="0"/>
           <w:numId w:val="2"/>
         </w:numPr>
+        <w:spacing w:before="40" w:after="40"/>
       </w:pPr>
       <w:r>
         <w:t>Dal PC: `http://127.0.0.1:8090/_/`</w:t>
@@ -5804,6 +5860,7 @@
           <w:ilvl w:val="0"/>
           <w:numId w:val="2"/>
         </w:numPr>
+        <w:spacing w:before="40" w:after="40"/>
       </w:pPr>
       <w:r>
         <w:t>Da rete locale: `http://192.168.1.x:8090/_/`</w:t>
@@ -5841,6 +5898,9 @@
       </w:r>
     </w:p>
     <w:p>
+      <w:pPr>
+        <w:spacing w:after="120"/>
+      </w:pPr>
       <w:r>
         <w:t xml:space="preserve">Dopo la prima installazione, alcune collection potrebbero avere le regole impostate su </w:t>
       </w:r>
@@ -5861,6 +5921,7 @@
           <w:ilvl w:val="0"/>
           <w:numId w:val="3"/>
         </w:numPr>
+        <w:spacing w:before="40" w:after="40"/>
       </w:pPr>
       <w:r>
         <w:t>Apri il pannello admin</w:t>
@@ -5873,6 +5934,7 @@
           <w:ilvl w:val="0"/>
           <w:numId w:val="3"/>
         </w:numPr>
+        <w:spacing w:before="40" w:after="40"/>
       </w:pPr>
       <w:r>
         <w:t xml:space="preserve">Vai su </w:t>
@@ -5894,6 +5956,7 @@
           <w:ilvl w:val="0"/>
           <w:numId w:val="3"/>
         </w:numPr>
+        <w:spacing w:before="40" w:after="40"/>
       </w:pPr>
       <w:r>
         <w:t xml:space="preserve">Clicca sulla scheda </w:t>
@@ -5912,6 +5975,7 @@
           <w:ilvl w:val="0"/>
           <w:numId w:val="3"/>
         </w:numPr>
+        <w:spacing w:before="40" w:after="40"/>
       </w:pPr>
       <w:r>
         <w:t>Svuota il campo per ciascuna regola (List, View, Create, Update, Delete)</w:t>
@@ -5924,6 +5988,7 @@
           <w:ilvl w:val="0"/>
           <w:numId w:val="3"/>
         </w:numPr>
+        <w:spacing w:before="40" w:after="40"/>
       </w:pPr>
       <w:r>
         <w:t xml:space="preserve">Clicca </w:t>
@@ -5942,6 +6007,7 @@
           <w:ilvl w:val="0"/>
           <w:numId w:val="3"/>
         </w:numPr>
+        <w:spacing w:before="40" w:after="40"/>
       </w:pPr>
       <w:r>
         <w:t>Ripeti per tutte le collection: `scontrini`, `righe_scontrino`, `prodotti`, `famiglie`, `comande`, `magazzini_comuni`, `movimenti_magazzino`, `comande_evase`, `utenti`, `menu`, `tavoli`, `configurazione`, `righe_pronte`, `volontari`, `sessioni_cassa`</w:t>
@@ -5985,8 +6051,6 @@
               <w:left w:val="single" w:sz="1" w:space="0" w:color="CCCCCC"/>
               <w:bottom w:val="single" w:sz="1" w:space="0" w:color="CCCCCC"/>
               <w:right w:val="single" w:sz="1" w:space="0" w:color="CCCCCC"/>
-              <w:insideH w:val="single" w:sz="1" w:space="0" w:color="CCCCCC"/>
-              <w:insideV w:val="single" w:sz="1" w:space="0" w:color="CCCCCC"/>
             </w:tcBorders>
             <w:shd w:val="clear" w:color="auto" w:fill="F5F5F5"/>
           </w:tcPr>
@@ -6014,8 +6078,6 @@
               <w:left w:val="single" w:sz="1" w:space="0" w:color="CCCCCC"/>
               <w:bottom w:val="single" w:sz="1" w:space="0" w:color="CCCCCC"/>
               <w:right w:val="single" w:sz="1" w:space="0" w:color="CCCCCC"/>
-              <w:insideH w:val="single" w:sz="1" w:space="0" w:color="CCCCCC"/>
-              <w:insideV w:val="single" w:sz="1" w:space="0" w:color="CCCCCC"/>
             </w:tcBorders>
             <w:shd w:val="clear" w:color="auto" w:fill="F5F5F5"/>
           </w:tcPr>
@@ -6045,8 +6107,6 @@
               <w:left w:val="single" w:sz="1" w:space="0" w:color="CCCCCC"/>
               <w:bottom w:val="single" w:sz="1" w:space="0" w:color="CCCCCC"/>
               <w:right w:val="single" w:sz="1" w:space="0" w:color="CCCCCC"/>
-              <w:insideH w:val="single" w:sz="1" w:space="0" w:color="CCCCCC"/>
-              <w:insideV w:val="single" w:sz="1" w:space="0" w:color="CCCCCC"/>
             </w:tcBorders>
             <w:shd w:val="clear" w:color="auto" w:fill="F9FAFB"/>
           </w:tcPr>
@@ -6065,8 +6125,6 @@
               <w:left w:val="single" w:sz="1" w:space="0" w:color="CCCCCC"/>
               <w:bottom w:val="single" w:sz="1" w:space="0" w:color="CCCCCC"/>
               <w:right w:val="single" w:sz="1" w:space="0" w:color="CCCCCC"/>
-              <w:insideH w:val="single" w:sz="1" w:space="0" w:color="CCCCCC"/>
-              <w:insideV w:val="single" w:sz="1" w:space="0" w:color="CCCCCC"/>
             </w:tcBorders>
             <w:shd w:val="clear" w:color="auto" w:fill="F9FAFB"/>
           </w:tcPr>
@@ -6087,8 +6145,6 @@
               <w:left w:val="single" w:sz="1" w:space="0" w:color="CCCCCC"/>
               <w:bottom w:val="single" w:sz="1" w:space="0" w:color="CCCCCC"/>
               <w:right w:val="single" w:sz="1" w:space="0" w:color="CCCCCC"/>
-              <w:insideH w:val="single" w:sz="1" w:space="0" w:color="CCCCCC"/>
-              <w:insideV w:val="single" w:sz="1" w:space="0" w:color="CCCCCC"/>
             </w:tcBorders>
           </w:tcPr>
           <w:p>
@@ -6106,8 +6162,6 @@
               <w:left w:val="single" w:sz="1" w:space="0" w:color="CCCCCC"/>
               <w:bottom w:val="single" w:sz="1" w:space="0" w:color="CCCCCC"/>
               <w:right w:val="single" w:sz="1" w:space="0" w:color="CCCCCC"/>
-              <w:insideH w:val="single" w:sz="1" w:space="0" w:color="CCCCCC"/>
-              <w:insideV w:val="single" w:sz="1" w:space="0" w:color="CCCCCC"/>
             </w:tcBorders>
           </w:tcPr>
           <w:p>
@@ -6127,8 +6181,6 @@
               <w:left w:val="single" w:sz="1" w:space="0" w:color="CCCCCC"/>
               <w:bottom w:val="single" w:sz="1" w:space="0" w:color="CCCCCC"/>
               <w:right w:val="single" w:sz="1" w:space="0" w:color="CCCCCC"/>
-              <w:insideH w:val="single" w:sz="1" w:space="0" w:color="CCCCCC"/>
-              <w:insideV w:val="single" w:sz="1" w:space="0" w:color="CCCCCC"/>
             </w:tcBorders>
             <w:shd w:val="clear" w:color="auto" w:fill="F9FAFB"/>
           </w:tcPr>
@@ -6147,8 +6199,6 @@
               <w:left w:val="single" w:sz="1" w:space="0" w:color="CCCCCC"/>
               <w:bottom w:val="single" w:sz="1" w:space="0" w:color="CCCCCC"/>
               <w:right w:val="single" w:sz="1" w:space="0" w:color="CCCCCC"/>
-              <w:insideH w:val="single" w:sz="1" w:space="0" w:color="CCCCCC"/>
-              <w:insideV w:val="single" w:sz="1" w:space="0" w:color="CCCCCC"/>
             </w:tcBorders>
             <w:shd w:val="clear" w:color="auto" w:fill="F9FAFB"/>
           </w:tcPr>
@@ -6169,8 +6219,6 @@
               <w:left w:val="single" w:sz="1" w:space="0" w:color="CCCCCC"/>
               <w:bottom w:val="single" w:sz="1" w:space="0" w:color="CCCCCC"/>
               <w:right w:val="single" w:sz="1" w:space="0" w:color="CCCCCC"/>
-              <w:insideH w:val="single" w:sz="1" w:space="0" w:color="CCCCCC"/>
-              <w:insideV w:val="single" w:sz="1" w:space="0" w:color="CCCCCC"/>
             </w:tcBorders>
           </w:tcPr>
           <w:p>
@@ -6188,8 +6236,6 @@
               <w:left w:val="single" w:sz="1" w:space="0" w:color="CCCCCC"/>
               <w:bottom w:val="single" w:sz="1" w:space="0" w:color="CCCCCC"/>
               <w:right w:val="single" w:sz="1" w:space="0" w:color="CCCCCC"/>
-              <w:insideH w:val="single" w:sz="1" w:space="0" w:color="CCCCCC"/>
-              <w:insideV w:val="single" w:sz="1" w:space="0" w:color="CCCCCC"/>
             </w:tcBorders>
           </w:tcPr>
           <w:p>
@@ -6213,6 +6259,9 @@
       </w:r>
     </w:p>
     <w:p>
+      <w:pPr>
+        <w:spacing w:after="120"/>
+      </w:pPr>
       <w:r>
         <w:t>PocketBase fa tutto: serve il database, espone le API REST e serve i file statici del frontend. Il browser si connette a PocketBase che risponde sia con i dati che con l'interfaccia grafica. Non serve internet: tutto gira localmente.</w:t>
       </w:r>
@@ -6235,6 +6284,7 @@
           <w:ilvl w:val="0"/>
           <w:numId w:val="3"/>
         </w:numPr>
+        <w:spacing w:before="40" w:after="40"/>
       </w:pPr>
       <w:r>
         <w:t>Modifica i file in `frontend-src/src/`</w:t>
@@ -6247,6 +6297,7 @@
           <w:ilvl w:val="0"/>
           <w:numId w:val="3"/>
         </w:numPr>
+        <w:spacing w:before="40" w:after="40"/>
       </w:pPr>
       <w:r>
         <w:t xml:space="preserve">Esegui </w:t>
@@ -6268,6 +6319,7 @@
           <w:ilvl w:val="0"/>
           <w:numId w:val="3"/>
         </w:numPr>
+        <w:spacing w:before="40" w:after="40"/>
       </w:pPr>
       <w:r>
         <w:t>Riavvia la cassa</w:t>
@@ -6285,6 +6337,9 @@
       </w:r>
     </w:p>
     <w:p>
+      <w:pPr>
+        <w:spacing w:after="120"/>
+      </w:pPr>
       <w:r>
         <w:t>Cassa Dalila è un progetto open source. PocketBase è rilasciato sotto licenza MIT. React è rilasciato sotto licenza MIT.</w:t>
       </w:r>

</xml_diff>